<commit_message>
feat: support reports with no findings
</commit_message>
<xml_diff>
--- a/resources/MAIN.docx
+++ b/resources/MAIN.docx
@@ -1,6 +1,6 @@
 
 <file path=word/document.xml><?xml version="1.0" encoding="utf-8"?>
-<w:document xmlns:wpc="http://schemas.microsoft.com/office/word/2010/wordprocessingCanvas" xmlns:cx="http://schemas.microsoft.com/office/drawing/2014/chartex" xmlns:cx1="http://schemas.microsoft.com/office/drawing/2015/9/8/chartex" xmlns:cx2="http://schemas.microsoft.com/office/drawing/2015/10/21/chartex" xmlns:cx3="http://schemas.microsoft.com/office/drawing/2016/5/9/chartex" xmlns:cx4="http://schemas.microsoft.com/office/drawing/2016/5/10/chartex" xmlns:cx5="http://schemas.microsoft.com/office/drawing/2016/5/11/chartex" xmlns:cx6="http://schemas.microsoft.com/office/drawing/2016/5/12/chartex" xmlns:cx7="http://schemas.microsoft.com/office/drawing/2016/5/13/chartex" xmlns:cx8="http://schemas.microsoft.com/office/drawing/2016/5/14/chartex" xmlns:mc="http://schemas.openxmlformats.org/markup-compatibility/2006" xmlns:aink="http://schemas.microsoft.com/office/drawing/2016/ink" xmlns:am3d="http://schemas.microsoft.com/office/drawing/2017/model3d" xmlns:o="urn:schemas-microsoft-com:office:office" xmlns:oel="http://schemas.microsoft.com/office/2019/extlst" xmlns:r="http://schemas.openxmlformats.org/officeDocument/2006/relationships" xmlns:m="http://schemas.openxmlformats.org/officeDocument/2006/math" xmlns:v="urn:schemas-microsoft-com:vml" xmlns:wp14="http://schemas.microsoft.com/office/word/2010/wordprocessingDrawing" xmlns:wp="http://schemas.openxmlformats.org/drawingml/2006/wordprocessingDrawing" xmlns:w10="urn:schemas-microsoft-com:office:word" xmlns:w="http://schemas.openxmlformats.org/wordprocessingml/2006/main" xmlns:w14="http://schemas.microsoft.com/office/word/2010/wordml" xmlns:w15="http://schemas.microsoft.com/office/word/2012/wordml" xmlns:w16cei="http://schemas.microsoft.com/office/word/2026/wordml/cei" xmlns:w16cex="http://schemas.microsoft.com/office/word/2018/wordml/cex" xmlns:w16cid="http://schemas.microsoft.com/office/word/2016/wordml/cid" xmlns:w16="http://schemas.microsoft.com/office/word/2018/wordml" xmlns:w16du="http://schemas.microsoft.com/office/word/2023/wordml/word16du" xmlns:w16sdtdh="http://schemas.microsoft.com/office/word/2020/wordml/sdtdatahash" xmlns:w16sdtfl="http://schemas.microsoft.com/office/word/2024/wordml/sdtformatlock" xmlns:w16se="http://schemas.microsoft.com/office/word/2015/wordml/symex" xmlns:wpg="http://schemas.microsoft.com/office/word/2010/wordprocessingGroup" xmlns:wpi="http://schemas.microsoft.com/office/word/2010/wordprocessingInk" xmlns:wne="http://schemas.microsoft.com/office/word/2006/wordml" xmlns:wps="http://schemas.microsoft.com/office/word/2010/wordprocessingShape" mc:Ignorable="w14 w15 w16se w16cid w16 w16cex w16sdtdh w16sdtfl w16du wp14">
+<w:document xmlns:wpc="http://schemas.microsoft.com/office/word/2010/wordprocessingCanvas" xmlns:cx="http://schemas.microsoft.com/office/drawing/2014/chartex" xmlns:cx1="http://schemas.microsoft.com/office/drawing/2015/9/8/chartex" xmlns:cx2="http://schemas.microsoft.com/office/drawing/2015/10/21/chartex" xmlns:cx3="http://schemas.microsoft.com/office/drawing/2016/5/9/chartex" xmlns:cx4="http://schemas.microsoft.com/office/drawing/2016/5/10/chartex" xmlns:cx5="http://schemas.microsoft.com/office/drawing/2016/5/11/chartex" xmlns:cx6="http://schemas.microsoft.com/office/drawing/2016/5/12/chartex" xmlns:cx7="http://schemas.microsoft.com/office/drawing/2016/5/13/chartex" xmlns:cx8="http://schemas.microsoft.com/office/drawing/2016/5/14/chartex" xmlns:mc="http://schemas.openxmlformats.org/markup-compatibility/2006" xmlns:aink="http://schemas.microsoft.com/office/drawing/2016/ink" xmlns:am3d="http://schemas.microsoft.com/office/drawing/2017/model3d" xmlns:o="urn:schemas-microsoft-com:office:office" xmlns:oel="http://schemas.microsoft.com/office/2019/extlst" xmlns:r="http://schemas.openxmlformats.org/officeDocument/2006/relationships" xmlns:m="http://schemas.openxmlformats.org/officeDocument/2006/math" xmlns:v="urn:schemas-microsoft-com:vml" xmlns:wp14="http://schemas.microsoft.com/office/word/2010/wordprocessingDrawing" xmlns:wp="http://schemas.openxmlformats.org/drawingml/2006/wordprocessingDrawing" xmlns:w10="urn:schemas-microsoft-com:office:word" xmlns:w="http://schemas.openxmlformats.org/wordprocessingml/2006/main" xmlns:w14="http://schemas.microsoft.com/office/word/2010/wordml" xmlns:w15="http://schemas.microsoft.com/office/word/2012/wordml" xmlns:w16cex="http://schemas.microsoft.com/office/word/2018/wordml/cex" xmlns:w16cid="http://schemas.microsoft.com/office/word/2016/wordml/cid" xmlns:w16="http://schemas.microsoft.com/office/word/2018/wordml" xmlns:w16du="http://schemas.microsoft.com/office/word/2023/wordml/word16du" xmlns:w16sdtdh="http://schemas.microsoft.com/office/word/2020/wordml/sdtdatahash" xmlns:w16sdtfl="http://schemas.microsoft.com/office/word/2024/wordml/sdtformatlock" xmlns:w16se="http://schemas.microsoft.com/office/word/2015/wordml/symex" xmlns:wpg="http://schemas.microsoft.com/office/word/2010/wordprocessingGroup" xmlns:wpi="http://schemas.microsoft.com/office/word/2010/wordprocessingInk" xmlns:wne="http://schemas.microsoft.com/office/word/2006/wordml" xmlns:wps="http://schemas.microsoft.com/office/word/2010/wordprocessingShape" mc:Ignorable="w14 w15 w16se w16cid w16 w16cex w16sdtdh w16sdtfl w16du wp14">
   <w:body>
     <w:p>
       <w:pPr>
@@ -335,7 +335,7 @@
                                     <w:rPr>
                                       <w:color w:val="FFFFFF" w:themeColor="background1"/>
                                     </w:rPr>
-                                    <w:t>Internal</w:t>
+                                    <w:t>{{network}}</w:t>
                                   </w:r>
                                 </w:p>
                               </w:tc>
@@ -586,7 +586,7 @@
                               <w:rPr>
                                 <w:color w:val="FFFFFF" w:themeColor="background1"/>
                               </w:rPr>
-                              <w:t>Internal</w:t>
+                              <w:t>{{network}}</w:t>
                             </w:r>
                           </w:p>
                         </w:tc>
@@ -3372,7 +3372,7 @@
               </wp:inline>
             </w:drawing>
           </mc:Choice>
-          <mc:Fallback>
+          <mc:Fallback xmlns:w16cei="http://schemas.microsoft.com/office/word/2026/wordml/cei">
             <w:pict>
               <v:oval w14:anchorId="5FB2E91B" id="Oval 2" o:spid="_x0000_s1026" style="width:105.3pt;height:105.3pt;visibility:visible;mso-wrap-style:square;mso-left-percent:-10001;mso-top-percent:-10001;mso-position-horizontal:absolute;mso-position-horizontal-relative:char;mso-position-vertical:absolute;mso-position-vertical-relative:line;mso-left-percent:-10001;mso-top-percent:-10001;v-text-anchor:middle" o:gfxdata="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" fillcolor="black [3200]" strokecolor="black [480]" strokeweight="1pt">
                 <v:stroke joinstyle="miter"/>
@@ -3456,7 +3456,7 @@
               </wp:inline>
             </w:drawing>
           </mc:Choice>
-          <mc:Fallback>
+          <mc:Fallback xmlns:w16cei="http://schemas.microsoft.com/office/word/2026/wordml/cei">
             <w:pict>
               <v:oval w14:anchorId="7AA4EED1" id="Oval 3" o:spid="_x0000_s1026" style="width:105.3pt;height:105.3pt;visibility:visible;mso-wrap-style:square;mso-left-percent:-10001;mso-top-percent:-10001;mso-position-horizontal:absolute;mso-position-horizontal-relative:char;mso-position-vertical:absolute;mso-position-vertical-relative:line;mso-left-percent:-10001;mso-top-percent:-10001;v-text-anchor:middle" o:gfxdata="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" fillcolor="#196b24 [3206]" strokecolor="#030f05 [486]" strokeweight="1pt">
                 <v:stroke joinstyle="miter"/>
@@ -3545,7 +3545,7 @@
               </wp:inline>
             </w:drawing>
           </mc:Choice>
-          <mc:Fallback>
+          <mc:Fallback xmlns:w16cei="http://schemas.microsoft.com/office/word/2026/wordml/cei">
             <w:pict>
               <v:oval w14:anchorId="7947AB30" id="Oval 4" o:spid="_x0000_s1026" style="width:105.3pt;height:105.3pt;visibility:visible;mso-wrap-style:square;mso-left-percent:-10001;mso-top-percent:-10001;mso-position-horizontal:absolute;mso-position-horizontal-relative:char;mso-position-vertical:absolute;mso-position-vertical-relative:line;mso-left-percent:-10001;mso-top-percent:-10001;v-text-anchor:middle" o:gfxdata="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" fillcolor="#f2f2f2 [3052]" strokecolor="black [480]" strokeweight="1pt">
                 <v:stroke joinstyle="miter"/>
@@ -4692,7 +4692,14 @@
           <w:b/>
           <w:bCs/>
         </w:rPr>
-        <w:t>Table 2</w:t>
+        <w:t xml:space="preserve">Table </w:t>
+      </w:r>
+      <w:r>
+        <w:rPr>
+          <w:b/>
+          <w:bCs/>
+        </w:rPr>
+        <w:t>3</w:t>
       </w:r>
       <w:r>
         <w:t>). For convenience, it has been included in this report on the following page.</w:t>
@@ -4723,7 +4730,13 @@
         <w:t xml:space="preserve">: </w:t>
       </w:r>
       <w:r>
-        <w:t>A summary of the Remediation Timeline Table found within the Application Penetration Testing Standard. URL provided in Table 2 of this report.</w:t>
+        <w:t xml:space="preserve">A summary of the Remediation Timeline Table found within the Application Penetration Testing Standard. URL provided in Table </w:t>
+      </w:r>
+      <w:r>
+        <w:t>3</w:t>
+      </w:r>
+      <w:r>
+        <w:t xml:space="preserve"> of this report.</w:t>
       </w:r>
     </w:p>
     <w:tbl>
@@ -4983,13 +4996,8 @@
           </w:p>
           <w:p/>
           <w:p>
-            <w:proofErr w:type="gramStart"/>
-            <w:r>
-              <w:t>o If</w:t>
-            </w:r>
-            <w:proofErr w:type="gramEnd"/>
-            <w:r>
-              <w:t xml:space="preserve"> the established timeline (12 hours) cannot be met due to technical limitations, a fully documented action plan must be provided. </w:t>
+            <w:r>
+              <w:t xml:space="preserve">If the established timeline (12 hours) cannot be met due to technical limitations, a fully documented action plan must be provided. </w:t>
             </w:r>
           </w:p>
           <w:p/>
@@ -6904,7 +6912,7 @@
 </file>
 
 <file path=word/endnotes.xml><?xml version="1.0" encoding="utf-8"?>
-<w:endnotes xmlns:wpc="http://schemas.microsoft.com/office/word/2010/wordprocessingCanvas" xmlns:cx="http://schemas.microsoft.com/office/drawing/2014/chartex" xmlns:cx1="http://schemas.microsoft.com/office/drawing/2015/9/8/chartex" xmlns:cx2="http://schemas.microsoft.com/office/drawing/2015/10/21/chartex" xmlns:cx3="http://schemas.microsoft.com/office/drawing/2016/5/9/chartex" xmlns:cx4="http://schemas.microsoft.com/office/drawing/2016/5/10/chartex" xmlns:cx5="http://schemas.microsoft.com/office/drawing/2016/5/11/chartex" xmlns:cx6="http://schemas.microsoft.com/office/drawing/2016/5/12/chartex" xmlns:cx7="http://schemas.microsoft.com/office/drawing/2016/5/13/chartex" xmlns:cx8="http://schemas.microsoft.com/office/drawing/2016/5/14/chartex" xmlns:mc="http://schemas.openxmlformats.org/markup-compatibility/2006" xmlns:aink="http://schemas.microsoft.com/office/drawing/2016/ink" xmlns:am3d="http://schemas.microsoft.com/office/drawing/2017/model3d" xmlns:o="urn:schemas-microsoft-com:office:office" xmlns:oel="http://schemas.microsoft.com/office/2019/extlst" xmlns:r="http://schemas.openxmlformats.org/officeDocument/2006/relationships" xmlns:m="http://schemas.openxmlformats.org/officeDocument/2006/math" xmlns:v="urn:schemas-microsoft-com:vml" xmlns:wp14="http://schemas.microsoft.com/office/word/2010/wordprocessingDrawing" xmlns:wp="http://schemas.openxmlformats.org/drawingml/2006/wordprocessingDrawing" xmlns:w10="urn:schemas-microsoft-com:office:word" xmlns:w="http://schemas.openxmlformats.org/wordprocessingml/2006/main" xmlns:w14="http://schemas.microsoft.com/office/word/2010/wordml" xmlns:w15="http://schemas.microsoft.com/office/word/2012/wordml" xmlns:w16cei="http://schemas.microsoft.com/office/word/2026/wordml/cei" xmlns:w16cex="http://schemas.microsoft.com/office/word/2018/wordml/cex" xmlns:w16cid="http://schemas.microsoft.com/office/word/2016/wordml/cid" xmlns:w16="http://schemas.microsoft.com/office/word/2018/wordml" xmlns:w16du="http://schemas.microsoft.com/office/word/2023/wordml/word16du" xmlns:w16sdtdh="http://schemas.microsoft.com/office/word/2020/wordml/sdtdatahash" xmlns:w16sdtfl="http://schemas.microsoft.com/office/word/2024/wordml/sdtformatlock" xmlns:w16se="http://schemas.microsoft.com/office/word/2015/wordml/symex" xmlns:wpg="http://schemas.microsoft.com/office/word/2010/wordprocessingGroup" xmlns:wpi="http://schemas.microsoft.com/office/word/2010/wordprocessingInk" xmlns:wne="http://schemas.microsoft.com/office/word/2006/wordml" xmlns:wps="http://schemas.microsoft.com/office/word/2010/wordprocessingShape" mc:Ignorable="w14 w15 w16se w16cid w16 w16cex w16sdtdh w16sdtfl w16du wp14">
+<w:endnotes xmlns:wpc="http://schemas.microsoft.com/office/word/2010/wordprocessingCanvas" xmlns:cx="http://schemas.microsoft.com/office/drawing/2014/chartex" xmlns:cx1="http://schemas.microsoft.com/office/drawing/2015/9/8/chartex" xmlns:cx2="http://schemas.microsoft.com/office/drawing/2015/10/21/chartex" xmlns:cx3="http://schemas.microsoft.com/office/drawing/2016/5/9/chartex" xmlns:cx4="http://schemas.microsoft.com/office/drawing/2016/5/10/chartex" xmlns:cx5="http://schemas.microsoft.com/office/drawing/2016/5/11/chartex" xmlns:cx6="http://schemas.microsoft.com/office/drawing/2016/5/12/chartex" xmlns:cx7="http://schemas.microsoft.com/office/drawing/2016/5/13/chartex" xmlns:cx8="http://schemas.microsoft.com/office/drawing/2016/5/14/chartex" xmlns:mc="http://schemas.openxmlformats.org/markup-compatibility/2006" xmlns:aink="http://schemas.microsoft.com/office/drawing/2016/ink" xmlns:am3d="http://schemas.microsoft.com/office/drawing/2017/model3d" xmlns:o="urn:schemas-microsoft-com:office:office" xmlns:oel="http://schemas.microsoft.com/office/2019/extlst" xmlns:r="http://schemas.openxmlformats.org/officeDocument/2006/relationships" xmlns:m="http://schemas.openxmlformats.org/officeDocument/2006/math" xmlns:v="urn:schemas-microsoft-com:vml" xmlns:wp14="http://schemas.microsoft.com/office/word/2010/wordprocessingDrawing" xmlns:wp="http://schemas.openxmlformats.org/drawingml/2006/wordprocessingDrawing" xmlns:w10="urn:schemas-microsoft-com:office:word" xmlns:w="http://schemas.openxmlformats.org/wordprocessingml/2006/main" xmlns:w14="http://schemas.microsoft.com/office/word/2010/wordml" xmlns:w15="http://schemas.microsoft.com/office/word/2012/wordml" xmlns:w16cex="http://schemas.microsoft.com/office/word/2018/wordml/cex" xmlns:w16cid="http://schemas.microsoft.com/office/word/2016/wordml/cid" xmlns:w16="http://schemas.microsoft.com/office/word/2018/wordml" xmlns:w16du="http://schemas.microsoft.com/office/word/2023/wordml/word16du" xmlns:w16sdtdh="http://schemas.microsoft.com/office/word/2020/wordml/sdtdatahash" xmlns:w16sdtfl="http://schemas.microsoft.com/office/word/2024/wordml/sdtformatlock" xmlns:w16se="http://schemas.microsoft.com/office/word/2015/wordml/symex" xmlns:wpg="http://schemas.microsoft.com/office/word/2010/wordprocessingGroup" xmlns:wpi="http://schemas.microsoft.com/office/word/2010/wordprocessingInk" xmlns:wne="http://schemas.microsoft.com/office/word/2006/wordml" xmlns:wps="http://schemas.microsoft.com/office/word/2010/wordprocessingShape" mc:Ignorable="w14 w15 w16se w16cid w16 w16cex w16sdtdh w16sdtfl w16du wp14">
   <w:endnote w:type="separator" w:id="-1">
     <w:p>
       <w:r>
@@ -6923,7 +6931,7 @@
 </file>
 
 <file path=word/footer1.xml><?xml version="1.0" encoding="utf-8"?>
-<w:ftr xmlns:wpc="http://schemas.microsoft.com/office/word/2010/wordprocessingCanvas" xmlns:cx="http://schemas.microsoft.com/office/drawing/2014/chartex" xmlns:cx1="http://schemas.microsoft.com/office/drawing/2015/9/8/chartex" xmlns:cx2="http://schemas.microsoft.com/office/drawing/2015/10/21/chartex" xmlns:cx3="http://schemas.microsoft.com/office/drawing/2016/5/9/chartex" xmlns:cx4="http://schemas.microsoft.com/office/drawing/2016/5/10/chartex" xmlns:cx5="http://schemas.microsoft.com/office/drawing/2016/5/11/chartex" xmlns:cx6="http://schemas.microsoft.com/office/drawing/2016/5/12/chartex" xmlns:cx7="http://schemas.microsoft.com/office/drawing/2016/5/13/chartex" xmlns:cx8="http://schemas.microsoft.com/office/drawing/2016/5/14/chartex" xmlns:mc="http://schemas.openxmlformats.org/markup-compatibility/2006" xmlns:aink="http://schemas.microsoft.com/office/drawing/2016/ink" xmlns:am3d="http://schemas.microsoft.com/office/drawing/2017/model3d" xmlns:o="urn:schemas-microsoft-com:office:office" xmlns:oel="http://schemas.microsoft.com/office/2019/extlst" xmlns:r="http://schemas.openxmlformats.org/officeDocument/2006/relationships" xmlns:m="http://schemas.openxmlformats.org/officeDocument/2006/math" xmlns:v="urn:schemas-microsoft-com:vml" xmlns:wp14="http://schemas.microsoft.com/office/word/2010/wordprocessingDrawing" xmlns:wp="http://schemas.openxmlformats.org/drawingml/2006/wordprocessingDrawing" xmlns:w10="urn:schemas-microsoft-com:office:word" xmlns:w="http://schemas.openxmlformats.org/wordprocessingml/2006/main" xmlns:w14="http://schemas.microsoft.com/office/word/2010/wordml" xmlns:w15="http://schemas.microsoft.com/office/word/2012/wordml" xmlns:w16cei="http://schemas.microsoft.com/office/word/2026/wordml/cei" xmlns:w16cex="http://schemas.microsoft.com/office/word/2018/wordml/cex" xmlns:w16cid="http://schemas.microsoft.com/office/word/2016/wordml/cid" xmlns:w16="http://schemas.microsoft.com/office/word/2018/wordml" xmlns:w16du="http://schemas.microsoft.com/office/word/2023/wordml/word16du" xmlns:w16sdtdh="http://schemas.microsoft.com/office/word/2020/wordml/sdtdatahash" xmlns:w16sdtfl="http://schemas.microsoft.com/office/word/2024/wordml/sdtformatlock" xmlns:w16se="http://schemas.microsoft.com/office/word/2015/wordml/symex" xmlns:wpg="http://schemas.microsoft.com/office/word/2010/wordprocessingGroup" xmlns:wpi="http://schemas.microsoft.com/office/word/2010/wordprocessingInk" xmlns:wne="http://schemas.microsoft.com/office/word/2006/wordml" xmlns:wps="http://schemas.microsoft.com/office/word/2010/wordprocessingShape" mc:Ignorable="w14 w15 w16se w16cid w16 w16cex w16sdtdh w16sdtfl w16du wp14">
+<w:ftr xmlns:wpc="http://schemas.microsoft.com/office/word/2010/wordprocessingCanvas" xmlns:cx="http://schemas.microsoft.com/office/drawing/2014/chartex" xmlns:cx1="http://schemas.microsoft.com/office/drawing/2015/9/8/chartex" xmlns:cx2="http://schemas.microsoft.com/office/drawing/2015/10/21/chartex" xmlns:cx3="http://schemas.microsoft.com/office/drawing/2016/5/9/chartex" xmlns:cx4="http://schemas.microsoft.com/office/drawing/2016/5/10/chartex" xmlns:cx5="http://schemas.microsoft.com/office/drawing/2016/5/11/chartex" xmlns:cx6="http://schemas.microsoft.com/office/drawing/2016/5/12/chartex" xmlns:cx7="http://schemas.microsoft.com/office/drawing/2016/5/13/chartex" xmlns:cx8="http://schemas.microsoft.com/office/drawing/2016/5/14/chartex" xmlns:mc="http://schemas.openxmlformats.org/markup-compatibility/2006" xmlns:aink="http://schemas.microsoft.com/office/drawing/2016/ink" xmlns:am3d="http://schemas.microsoft.com/office/drawing/2017/model3d" xmlns:o="urn:schemas-microsoft-com:office:office" xmlns:oel="http://schemas.microsoft.com/office/2019/extlst" xmlns:r="http://schemas.openxmlformats.org/officeDocument/2006/relationships" xmlns:m="http://schemas.openxmlformats.org/officeDocument/2006/math" xmlns:v="urn:schemas-microsoft-com:vml" xmlns:wp14="http://schemas.microsoft.com/office/word/2010/wordprocessingDrawing" xmlns:wp="http://schemas.openxmlformats.org/drawingml/2006/wordprocessingDrawing" xmlns:w10="urn:schemas-microsoft-com:office:word" xmlns:w="http://schemas.openxmlformats.org/wordprocessingml/2006/main" xmlns:w14="http://schemas.microsoft.com/office/word/2010/wordml" xmlns:w15="http://schemas.microsoft.com/office/word/2012/wordml" xmlns:w16cex="http://schemas.microsoft.com/office/word/2018/wordml/cex" xmlns:w16cid="http://schemas.microsoft.com/office/word/2016/wordml/cid" xmlns:w16="http://schemas.microsoft.com/office/word/2018/wordml" xmlns:w16du="http://schemas.microsoft.com/office/word/2023/wordml/word16du" xmlns:w16sdtdh="http://schemas.microsoft.com/office/word/2020/wordml/sdtdatahash" xmlns:w16sdtfl="http://schemas.microsoft.com/office/word/2024/wordml/sdtformatlock" xmlns:w16se="http://schemas.microsoft.com/office/word/2015/wordml/symex" xmlns:wpg="http://schemas.microsoft.com/office/word/2010/wordprocessingGroup" xmlns:wpi="http://schemas.microsoft.com/office/word/2010/wordprocessingInk" xmlns:wne="http://schemas.microsoft.com/office/word/2006/wordml" xmlns:wps="http://schemas.microsoft.com/office/word/2010/wordprocessingShape" mc:Ignorable="w14 w15 w16se w16cid w16 w16cex w16sdtdh w16sdtfl w16du wp14">
   <w:p>
     <w:pPr>
       <w:pStyle w:val="Footer"/>
@@ -7103,7 +7111,7 @@
 </file>
 
 <file path=word/footer2.xml><?xml version="1.0" encoding="utf-8"?>
-<w:ftr xmlns:wpc="http://schemas.microsoft.com/office/word/2010/wordprocessingCanvas" xmlns:cx="http://schemas.microsoft.com/office/drawing/2014/chartex" xmlns:cx1="http://schemas.microsoft.com/office/drawing/2015/9/8/chartex" xmlns:cx2="http://schemas.microsoft.com/office/drawing/2015/10/21/chartex" xmlns:cx3="http://schemas.microsoft.com/office/drawing/2016/5/9/chartex" xmlns:cx4="http://schemas.microsoft.com/office/drawing/2016/5/10/chartex" xmlns:cx5="http://schemas.microsoft.com/office/drawing/2016/5/11/chartex" xmlns:cx6="http://schemas.microsoft.com/office/drawing/2016/5/12/chartex" xmlns:cx7="http://schemas.microsoft.com/office/drawing/2016/5/13/chartex" xmlns:cx8="http://schemas.microsoft.com/office/drawing/2016/5/14/chartex" xmlns:mc="http://schemas.openxmlformats.org/markup-compatibility/2006" xmlns:aink="http://schemas.microsoft.com/office/drawing/2016/ink" xmlns:am3d="http://schemas.microsoft.com/office/drawing/2017/model3d" xmlns:o="urn:schemas-microsoft-com:office:office" xmlns:oel="http://schemas.microsoft.com/office/2019/extlst" xmlns:r="http://schemas.openxmlformats.org/officeDocument/2006/relationships" xmlns:m="http://schemas.openxmlformats.org/officeDocument/2006/math" xmlns:v="urn:schemas-microsoft-com:vml" xmlns:wp14="http://schemas.microsoft.com/office/word/2010/wordprocessingDrawing" xmlns:wp="http://schemas.openxmlformats.org/drawingml/2006/wordprocessingDrawing" xmlns:w10="urn:schemas-microsoft-com:office:word" xmlns:w="http://schemas.openxmlformats.org/wordprocessingml/2006/main" xmlns:w14="http://schemas.microsoft.com/office/word/2010/wordml" xmlns:w15="http://schemas.microsoft.com/office/word/2012/wordml" xmlns:w16cei="http://schemas.microsoft.com/office/word/2026/wordml/cei" xmlns:w16cex="http://schemas.microsoft.com/office/word/2018/wordml/cex" xmlns:w16cid="http://schemas.microsoft.com/office/word/2016/wordml/cid" xmlns:w16="http://schemas.microsoft.com/office/word/2018/wordml" xmlns:w16du="http://schemas.microsoft.com/office/word/2023/wordml/word16du" xmlns:w16sdtdh="http://schemas.microsoft.com/office/word/2020/wordml/sdtdatahash" xmlns:w16sdtfl="http://schemas.microsoft.com/office/word/2024/wordml/sdtformatlock" xmlns:w16se="http://schemas.microsoft.com/office/word/2015/wordml/symex" xmlns:wpg="http://schemas.microsoft.com/office/word/2010/wordprocessingGroup" xmlns:wpi="http://schemas.microsoft.com/office/word/2010/wordprocessingInk" xmlns:wne="http://schemas.microsoft.com/office/word/2006/wordml" xmlns:wps="http://schemas.microsoft.com/office/word/2010/wordprocessingShape" mc:Ignorable="w14 w15 w16se w16cid w16 w16cex w16sdtdh w16sdtfl w16du wp14">
+<w:ftr xmlns:wpc="http://schemas.microsoft.com/office/word/2010/wordprocessingCanvas" xmlns:cx="http://schemas.microsoft.com/office/drawing/2014/chartex" xmlns:cx1="http://schemas.microsoft.com/office/drawing/2015/9/8/chartex" xmlns:cx2="http://schemas.microsoft.com/office/drawing/2015/10/21/chartex" xmlns:cx3="http://schemas.microsoft.com/office/drawing/2016/5/9/chartex" xmlns:cx4="http://schemas.microsoft.com/office/drawing/2016/5/10/chartex" xmlns:cx5="http://schemas.microsoft.com/office/drawing/2016/5/11/chartex" xmlns:cx6="http://schemas.microsoft.com/office/drawing/2016/5/12/chartex" xmlns:cx7="http://schemas.microsoft.com/office/drawing/2016/5/13/chartex" xmlns:cx8="http://schemas.microsoft.com/office/drawing/2016/5/14/chartex" xmlns:mc="http://schemas.openxmlformats.org/markup-compatibility/2006" xmlns:aink="http://schemas.microsoft.com/office/drawing/2016/ink" xmlns:am3d="http://schemas.microsoft.com/office/drawing/2017/model3d" xmlns:o="urn:schemas-microsoft-com:office:office" xmlns:oel="http://schemas.microsoft.com/office/2019/extlst" xmlns:r="http://schemas.openxmlformats.org/officeDocument/2006/relationships" xmlns:m="http://schemas.openxmlformats.org/officeDocument/2006/math" xmlns:v="urn:schemas-microsoft-com:vml" xmlns:wp14="http://schemas.microsoft.com/office/word/2010/wordprocessingDrawing" xmlns:wp="http://schemas.openxmlformats.org/drawingml/2006/wordprocessingDrawing" xmlns:w10="urn:schemas-microsoft-com:office:word" xmlns:w="http://schemas.openxmlformats.org/wordprocessingml/2006/main" xmlns:w14="http://schemas.microsoft.com/office/word/2010/wordml" xmlns:w15="http://schemas.microsoft.com/office/word/2012/wordml" xmlns:w16cex="http://schemas.microsoft.com/office/word/2018/wordml/cex" xmlns:w16cid="http://schemas.microsoft.com/office/word/2016/wordml/cid" xmlns:w16="http://schemas.microsoft.com/office/word/2018/wordml" xmlns:w16du="http://schemas.microsoft.com/office/word/2023/wordml/word16du" xmlns:w16sdtdh="http://schemas.microsoft.com/office/word/2020/wordml/sdtdatahash" xmlns:w16sdtfl="http://schemas.microsoft.com/office/word/2024/wordml/sdtformatlock" xmlns:w16se="http://schemas.microsoft.com/office/word/2015/wordml/symex" xmlns:wpg="http://schemas.microsoft.com/office/word/2010/wordprocessingGroup" xmlns:wpi="http://schemas.microsoft.com/office/word/2010/wordprocessingInk" xmlns:wne="http://schemas.microsoft.com/office/word/2006/wordml" xmlns:wps="http://schemas.microsoft.com/office/word/2010/wordprocessingShape" mc:Ignorable="w14 w15 w16se w16cid w16 w16cex w16sdtdh w16sdtfl w16du wp14">
   <w:p>
     <w:pPr>
       <w:pStyle w:val="Footer"/>
@@ -7432,7 +7440,7 @@
 </file>
 
 <file path=word/footer3.xml><?xml version="1.0" encoding="utf-8"?>
-<w:ftr xmlns:wpc="http://schemas.microsoft.com/office/word/2010/wordprocessingCanvas" xmlns:cx="http://schemas.microsoft.com/office/drawing/2014/chartex" xmlns:cx1="http://schemas.microsoft.com/office/drawing/2015/9/8/chartex" xmlns:cx2="http://schemas.microsoft.com/office/drawing/2015/10/21/chartex" xmlns:cx3="http://schemas.microsoft.com/office/drawing/2016/5/9/chartex" xmlns:cx4="http://schemas.microsoft.com/office/drawing/2016/5/10/chartex" xmlns:cx5="http://schemas.microsoft.com/office/drawing/2016/5/11/chartex" xmlns:cx6="http://schemas.microsoft.com/office/drawing/2016/5/12/chartex" xmlns:cx7="http://schemas.microsoft.com/office/drawing/2016/5/13/chartex" xmlns:cx8="http://schemas.microsoft.com/office/drawing/2016/5/14/chartex" xmlns:mc="http://schemas.openxmlformats.org/markup-compatibility/2006" xmlns:aink="http://schemas.microsoft.com/office/drawing/2016/ink" xmlns:am3d="http://schemas.microsoft.com/office/drawing/2017/model3d" xmlns:o="urn:schemas-microsoft-com:office:office" xmlns:oel="http://schemas.microsoft.com/office/2019/extlst" xmlns:r="http://schemas.openxmlformats.org/officeDocument/2006/relationships" xmlns:m="http://schemas.openxmlformats.org/officeDocument/2006/math" xmlns:v="urn:schemas-microsoft-com:vml" xmlns:wp14="http://schemas.microsoft.com/office/word/2010/wordprocessingDrawing" xmlns:wp="http://schemas.openxmlformats.org/drawingml/2006/wordprocessingDrawing" xmlns:w10="urn:schemas-microsoft-com:office:word" xmlns:w="http://schemas.openxmlformats.org/wordprocessingml/2006/main" xmlns:w14="http://schemas.microsoft.com/office/word/2010/wordml" xmlns:w15="http://schemas.microsoft.com/office/word/2012/wordml" xmlns:w16cei="http://schemas.microsoft.com/office/word/2026/wordml/cei" xmlns:w16cex="http://schemas.microsoft.com/office/word/2018/wordml/cex" xmlns:w16cid="http://schemas.microsoft.com/office/word/2016/wordml/cid" xmlns:w16="http://schemas.microsoft.com/office/word/2018/wordml" xmlns:w16du="http://schemas.microsoft.com/office/word/2023/wordml/word16du" xmlns:w16sdtdh="http://schemas.microsoft.com/office/word/2020/wordml/sdtdatahash" xmlns:w16sdtfl="http://schemas.microsoft.com/office/word/2024/wordml/sdtformatlock" xmlns:w16se="http://schemas.microsoft.com/office/word/2015/wordml/symex" xmlns:wpg="http://schemas.microsoft.com/office/word/2010/wordprocessingGroup" xmlns:wpi="http://schemas.microsoft.com/office/word/2010/wordprocessingInk" xmlns:wne="http://schemas.microsoft.com/office/word/2006/wordml" xmlns:wps="http://schemas.microsoft.com/office/word/2010/wordprocessingShape" mc:Ignorable="w14 w15 w16se w16cid w16 w16cex w16sdtdh w16sdtfl w16du wp14">
+<w:ftr xmlns:wpc="http://schemas.microsoft.com/office/word/2010/wordprocessingCanvas" xmlns:cx="http://schemas.microsoft.com/office/drawing/2014/chartex" xmlns:cx1="http://schemas.microsoft.com/office/drawing/2015/9/8/chartex" xmlns:cx2="http://schemas.microsoft.com/office/drawing/2015/10/21/chartex" xmlns:cx3="http://schemas.microsoft.com/office/drawing/2016/5/9/chartex" xmlns:cx4="http://schemas.microsoft.com/office/drawing/2016/5/10/chartex" xmlns:cx5="http://schemas.microsoft.com/office/drawing/2016/5/11/chartex" xmlns:cx6="http://schemas.microsoft.com/office/drawing/2016/5/12/chartex" xmlns:cx7="http://schemas.microsoft.com/office/drawing/2016/5/13/chartex" xmlns:cx8="http://schemas.microsoft.com/office/drawing/2016/5/14/chartex" xmlns:mc="http://schemas.openxmlformats.org/markup-compatibility/2006" xmlns:aink="http://schemas.microsoft.com/office/drawing/2016/ink" xmlns:am3d="http://schemas.microsoft.com/office/drawing/2017/model3d" xmlns:o="urn:schemas-microsoft-com:office:office" xmlns:oel="http://schemas.microsoft.com/office/2019/extlst" xmlns:r="http://schemas.openxmlformats.org/officeDocument/2006/relationships" xmlns:m="http://schemas.openxmlformats.org/officeDocument/2006/math" xmlns:v="urn:schemas-microsoft-com:vml" xmlns:wp14="http://schemas.microsoft.com/office/word/2010/wordprocessingDrawing" xmlns:wp="http://schemas.openxmlformats.org/drawingml/2006/wordprocessingDrawing" xmlns:w10="urn:schemas-microsoft-com:office:word" xmlns:w="http://schemas.openxmlformats.org/wordprocessingml/2006/main" xmlns:w14="http://schemas.microsoft.com/office/word/2010/wordml" xmlns:w15="http://schemas.microsoft.com/office/word/2012/wordml" xmlns:w16cex="http://schemas.microsoft.com/office/word/2018/wordml/cex" xmlns:w16cid="http://schemas.microsoft.com/office/word/2016/wordml/cid" xmlns:w16="http://schemas.microsoft.com/office/word/2018/wordml" xmlns:w16du="http://schemas.microsoft.com/office/word/2023/wordml/word16du" xmlns:w16sdtdh="http://schemas.microsoft.com/office/word/2020/wordml/sdtdatahash" xmlns:w16sdtfl="http://schemas.microsoft.com/office/word/2024/wordml/sdtformatlock" xmlns:w16se="http://schemas.microsoft.com/office/word/2015/wordml/symex" xmlns:wpg="http://schemas.microsoft.com/office/word/2010/wordprocessingGroup" xmlns:wpi="http://schemas.microsoft.com/office/word/2010/wordprocessingInk" xmlns:wne="http://schemas.microsoft.com/office/word/2006/wordml" xmlns:wps="http://schemas.microsoft.com/office/word/2010/wordprocessingShape" mc:Ignorable="w14 w15 w16se w16cid w16 w16cex w16sdtdh w16sdtfl w16du wp14">
   <w:p>
     <w:pPr>
       <w:pStyle w:val="Footer"/>
@@ -7541,7 +7549,7 @@
 </file>
 
 <file path=word/footer4.xml><?xml version="1.0" encoding="utf-8"?>
-<w:ftr xmlns:wpc="http://schemas.microsoft.com/office/word/2010/wordprocessingCanvas" xmlns:cx="http://schemas.microsoft.com/office/drawing/2014/chartex" xmlns:cx1="http://schemas.microsoft.com/office/drawing/2015/9/8/chartex" xmlns:cx2="http://schemas.microsoft.com/office/drawing/2015/10/21/chartex" xmlns:cx3="http://schemas.microsoft.com/office/drawing/2016/5/9/chartex" xmlns:cx4="http://schemas.microsoft.com/office/drawing/2016/5/10/chartex" xmlns:cx5="http://schemas.microsoft.com/office/drawing/2016/5/11/chartex" xmlns:cx6="http://schemas.microsoft.com/office/drawing/2016/5/12/chartex" xmlns:cx7="http://schemas.microsoft.com/office/drawing/2016/5/13/chartex" xmlns:cx8="http://schemas.microsoft.com/office/drawing/2016/5/14/chartex" xmlns:mc="http://schemas.openxmlformats.org/markup-compatibility/2006" xmlns:aink="http://schemas.microsoft.com/office/drawing/2016/ink" xmlns:am3d="http://schemas.microsoft.com/office/drawing/2017/model3d" xmlns:o="urn:schemas-microsoft-com:office:office" xmlns:oel="http://schemas.microsoft.com/office/2019/extlst" xmlns:r="http://schemas.openxmlformats.org/officeDocument/2006/relationships" xmlns:m="http://schemas.openxmlformats.org/officeDocument/2006/math" xmlns:v="urn:schemas-microsoft-com:vml" xmlns:wp14="http://schemas.microsoft.com/office/word/2010/wordprocessingDrawing" xmlns:wp="http://schemas.openxmlformats.org/drawingml/2006/wordprocessingDrawing" xmlns:w10="urn:schemas-microsoft-com:office:word" xmlns:w="http://schemas.openxmlformats.org/wordprocessingml/2006/main" xmlns:w14="http://schemas.microsoft.com/office/word/2010/wordml" xmlns:w15="http://schemas.microsoft.com/office/word/2012/wordml" xmlns:w16cei="http://schemas.microsoft.com/office/word/2026/wordml/cei" xmlns:w16cex="http://schemas.microsoft.com/office/word/2018/wordml/cex" xmlns:w16cid="http://schemas.microsoft.com/office/word/2016/wordml/cid" xmlns:w16="http://schemas.microsoft.com/office/word/2018/wordml" xmlns:w16du="http://schemas.microsoft.com/office/word/2023/wordml/word16du" xmlns:w16sdtdh="http://schemas.microsoft.com/office/word/2020/wordml/sdtdatahash" xmlns:w16sdtfl="http://schemas.microsoft.com/office/word/2024/wordml/sdtformatlock" xmlns:w16se="http://schemas.microsoft.com/office/word/2015/wordml/symex" xmlns:wpg="http://schemas.microsoft.com/office/word/2010/wordprocessingGroup" xmlns:wpi="http://schemas.microsoft.com/office/word/2010/wordprocessingInk" xmlns:wne="http://schemas.microsoft.com/office/word/2006/wordml" xmlns:wps="http://schemas.microsoft.com/office/word/2010/wordprocessingShape" mc:Ignorable="w14 w15 w16se w16cid w16 w16cex w16sdtdh w16sdtfl w16du wp14">
+<w:ftr xmlns:wpc="http://schemas.microsoft.com/office/word/2010/wordprocessingCanvas" xmlns:cx="http://schemas.microsoft.com/office/drawing/2014/chartex" xmlns:cx1="http://schemas.microsoft.com/office/drawing/2015/9/8/chartex" xmlns:cx2="http://schemas.microsoft.com/office/drawing/2015/10/21/chartex" xmlns:cx3="http://schemas.microsoft.com/office/drawing/2016/5/9/chartex" xmlns:cx4="http://schemas.microsoft.com/office/drawing/2016/5/10/chartex" xmlns:cx5="http://schemas.microsoft.com/office/drawing/2016/5/11/chartex" xmlns:cx6="http://schemas.microsoft.com/office/drawing/2016/5/12/chartex" xmlns:cx7="http://schemas.microsoft.com/office/drawing/2016/5/13/chartex" xmlns:cx8="http://schemas.microsoft.com/office/drawing/2016/5/14/chartex" xmlns:mc="http://schemas.openxmlformats.org/markup-compatibility/2006" xmlns:aink="http://schemas.microsoft.com/office/drawing/2016/ink" xmlns:am3d="http://schemas.microsoft.com/office/drawing/2017/model3d" xmlns:o="urn:schemas-microsoft-com:office:office" xmlns:oel="http://schemas.microsoft.com/office/2019/extlst" xmlns:r="http://schemas.openxmlformats.org/officeDocument/2006/relationships" xmlns:m="http://schemas.openxmlformats.org/officeDocument/2006/math" xmlns:v="urn:schemas-microsoft-com:vml" xmlns:wp14="http://schemas.microsoft.com/office/word/2010/wordprocessingDrawing" xmlns:wp="http://schemas.openxmlformats.org/drawingml/2006/wordprocessingDrawing" xmlns:w10="urn:schemas-microsoft-com:office:word" xmlns:w="http://schemas.openxmlformats.org/wordprocessingml/2006/main" xmlns:w14="http://schemas.microsoft.com/office/word/2010/wordml" xmlns:w15="http://schemas.microsoft.com/office/word/2012/wordml" xmlns:w16cex="http://schemas.microsoft.com/office/word/2018/wordml/cex" xmlns:w16cid="http://schemas.microsoft.com/office/word/2016/wordml/cid" xmlns:w16="http://schemas.microsoft.com/office/word/2018/wordml" xmlns:w16du="http://schemas.microsoft.com/office/word/2023/wordml/word16du" xmlns:w16sdtdh="http://schemas.microsoft.com/office/word/2020/wordml/sdtdatahash" xmlns:w16sdtfl="http://schemas.microsoft.com/office/word/2024/wordml/sdtformatlock" xmlns:w16se="http://schemas.microsoft.com/office/word/2015/wordml/symex" xmlns:wpg="http://schemas.microsoft.com/office/word/2010/wordprocessingGroup" xmlns:wpi="http://schemas.microsoft.com/office/word/2010/wordprocessingInk" xmlns:wne="http://schemas.microsoft.com/office/word/2006/wordml" xmlns:wps="http://schemas.microsoft.com/office/word/2010/wordprocessingShape" mc:Ignorable="w14 w15 w16se w16cid w16 w16cex w16sdtdh w16sdtfl w16du wp14">
   <w:p>
     <w:pPr>
       <w:pStyle w:val="Footer"/>
@@ -7650,7 +7658,7 @@
 </file>
 
 <file path=word/footer5.xml><?xml version="1.0" encoding="utf-8"?>
-<w:ftr xmlns:wpc="http://schemas.microsoft.com/office/word/2010/wordprocessingCanvas" xmlns:cx="http://schemas.microsoft.com/office/drawing/2014/chartex" xmlns:cx1="http://schemas.microsoft.com/office/drawing/2015/9/8/chartex" xmlns:cx2="http://schemas.microsoft.com/office/drawing/2015/10/21/chartex" xmlns:cx3="http://schemas.microsoft.com/office/drawing/2016/5/9/chartex" xmlns:cx4="http://schemas.microsoft.com/office/drawing/2016/5/10/chartex" xmlns:cx5="http://schemas.microsoft.com/office/drawing/2016/5/11/chartex" xmlns:cx6="http://schemas.microsoft.com/office/drawing/2016/5/12/chartex" xmlns:cx7="http://schemas.microsoft.com/office/drawing/2016/5/13/chartex" xmlns:cx8="http://schemas.microsoft.com/office/drawing/2016/5/14/chartex" xmlns:mc="http://schemas.openxmlformats.org/markup-compatibility/2006" xmlns:aink="http://schemas.microsoft.com/office/drawing/2016/ink" xmlns:am3d="http://schemas.microsoft.com/office/drawing/2017/model3d" xmlns:o="urn:schemas-microsoft-com:office:office" xmlns:oel="http://schemas.microsoft.com/office/2019/extlst" xmlns:r="http://schemas.openxmlformats.org/officeDocument/2006/relationships" xmlns:m="http://schemas.openxmlformats.org/officeDocument/2006/math" xmlns:v="urn:schemas-microsoft-com:vml" xmlns:wp14="http://schemas.microsoft.com/office/word/2010/wordprocessingDrawing" xmlns:wp="http://schemas.openxmlformats.org/drawingml/2006/wordprocessingDrawing" xmlns:w10="urn:schemas-microsoft-com:office:word" xmlns:w="http://schemas.openxmlformats.org/wordprocessingml/2006/main" xmlns:w14="http://schemas.microsoft.com/office/word/2010/wordml" xmlns:w15="http://schemas.microsoft.com/office/word/2012/wordml" xmlns:w16cei="http://schemas.microsoft.com/office/word/2026/wordml/cei" xmlns:w16cex="http://schemas.microsoft.com/office/word/2018/wordml/cex" xmlns:w16cid="http://schemas.microsoft.com/office/word/2016/wordml/cid" xmlns:w16="http://schemas.microsoft.com/office/word/2018/wordml" xmlns:w16du="http://schemas.microsoft.com/office/word/2023/wordml/word16du" xmlns:w16sdtdh="http://schemas.microsoft.com/office/word/2020/wordml/sdtdatahash" xmlns:w16sdtfl="http://schemas.microsoft.com/office/word/2024/wordml/sdtformatlock" xmlns:w16se="http://schemas.microsoft.com/office/word/2015/wordml/symex" xmlns:wpg="http://schemas.microsoft.com/office/word/2010/wordprocessingGroup" xmlns:wpi="http://schemas.microsoft.com/office/word/2010/wordprocessingInk" xmlns:wne="http://schemas.microsoft.com/office/word/2006/wordml" xmlns:wps="http://schemas.microsoft.com/office/word/2010/wordprocessingShape" mc:Ignorable="w14 w15 w16se w16cid w16 w16cex w16sdtdh w16sdtfl w16du wp14">
+<w:ftr xmlns:wpc="http://schemas.microsoft.com/office/word/2010/wordprocessingCanvas" xmlns:cx="http://schemas.microsoft.com/office/drawing/2014/chartex" xmlns:cx1="http://schemas.microsoft.com/office/drawing/2015/9/8/chartex" xmlns:cx2="http://schemas.microsoft.com/office/drawing/2015/10/21/chartex" xmlns:cx3="http://schemas.microsoft.com/office/drawing/2016/5/9/chartex" xmlns:cx4="http://schemas.microsoft.com/office/drawing/2016/5/10/chartex" xmlns:cx5="http://schemas.microsoft.com/office/drawing/2016/5/11/chartex" xmlns:cx6="http://schemas.microsoft.com/office/drawing/2016/5/12/chartex" xmlns:cx7="http://schemas.microsoft.com/office/drawing/2016/5/13/chartex" xmlns:cx8="http://schemas.microsoft.com/office/drawing/2016/5/14/chartex" xmlns:mc="http://schemas.openxmlformats.org/markup-compatibility/2006" xmlns:aink="http://schemas.microsoft.com/office/drawing/2016/ink" xmlns:am3d="http://schemas.microsoft.com/office/drawing/2017/model3d" xmlns:o="urn:schemas-microsoft-com:office:office" xmlns:oel="http://schemas.microsoft.com/office/2019/extlst" xmlns:r="http://schemas.openxmlformats.org/officeDocument/2006/relationships" xmlns:m="http://schemas.openxmlformats.org/officeDocument/2006/math" xmlns:v="urn:schemas-microsoft-com:vml" xmlns:wp14="http://schemas.microsoft.com/office/word/2010/wordprocessingDrawing" xmlns:wp="http://schemas.openxmlformats.org/drawingml/2006/wordprocessingDrawing" xmlns:w10="urn:schemas-microsoft-com:office:word" xmlns:w="http://schemas.openxmlformats.org/wordprocessingml/2006/main" xmlns:w14="http://schemas.microsoft.com/office/word/2010/wordml" xmlns:w15="http://schemas.microsoft.com/office/word/2012/wordml" xmlns:w16cex="http://schemas.microsoft.com/office/word/2018/wordml/cex" xmlns:w16cid="http://schemas.microsoft.com/office/word/2016/wordml/cid" xmlns:w16="http://schemas.microsoft.com/office/word/2018/wordml" xmlns:w16du="http://schemas.microsoft.com/office/word/2023/wordml/word16du" xmlns:w16sdtdh="http://schemas.microsoft.com/office/word/2020/wordml/sdtdatahash" xmlns:w16sdtfl="http://schemas.microsoft.com/office/word/2024/wordml/sdtformatlock" xmlns:w16se="http://schemas.microsoft.com/office/word/2015/wordml/symex" xmlns:wpg="http://schemas.microsoft.com/office/word/2010/wordprocessingGroup" xmlns:wpi="http://schemas.microsoft.com/office/word/2010/wordprocessingInk" xmlns:wne="http://schemas.microsoft.com/office/word/2006/wordml" xmlns:wps="http://schemas.microsoft.com/office/word/2010/wordprocessingShape" mc:Ignorable="w14 w15 w16se w16cid w16 w16cex w16sdtdh w16sdtfl w16du wp14">
   <w:p>
     <w:pPr>
       <w:pStyle w:val="Footer"/>
@@ -8219,7 +8227,7 @@
 </file>
 
 <file path=word/footer6.xml><?xml version="1.0" encoding="utf-8"?>
-<w:ftr xmlns:wpc="http://schemas.microsoft.com/office/word/2010/wordprocessingCanvas" xmlns:cx="http://schemas.microsoft.com/office/drawing/2014/chartex" xmlns:cx1="http://schemas.microsoft.com/office/drawing/2015/9/8/chartex" xmlns:cx2="http://schemas.microsoft.com/office/drawing/2015/10/21/chartex" xmlns:cx3="http://schemas.microsoft.com/office/drawing/2016/5/9/chartex" xmlns:cx4="http://schemas.microsoft.com/office/drawing/2016/5/10/chartex" xmlns:cx5="http://schemas.microsoft.com/office/drawing/2016/5/11/chartex" xmlns:cx6="http://schemas.microsoft.com/office/drawing/2016/5/12/chartex" xmlns:cx7="http://schemas.microsoft.com/office/drawing/2016/5/13/chartex" xmlns:cx8="http://schemas.microsoft.com/office/drawing/2016/5/14/chartex" xmlns:mc="http://schemas.openxmlformats.org/markup-compatibility/2006" xmlns:aink="http://schemas.microsoft.com/office/drawing/2016/ink" xmlns:am3d="http://schemas.microsoft.com/office/drawing/2017/model3d" xmlns:o="urn:schemas-microsoft-com:office:office" xmlns:oel="http://schemas.microsoft.com/office/2019/extlst" xmlns:r="http://schemas.openxmlformats.org/officeDocument/2006/relationships" xmlns:m="http://schemas.openxmlformats.org/officeDocument/2006/math" xmlns:v="urn:schemas-microsoft-com:vml" xmlns:wp14="http://schemas.microsoft.com/office/word/2010/wordprocessingDrawing" xmlns:wp="http://schemas.openxmlformats.org/drawingml/2006/wordprocessingDrawing" xmlns:w10="urn:schemas-microsoft-com:office:word" xmlns:w="http://schemas.openxmlformats.org/wordprocessingml/2006/main" xmlns:w14="http://schemas.microsoft.com/office/word/2010/wordml" xmlns:w15="http://schemas.microsoft.com/office/word/2012/wordml" xmlns:w16cei="http://schemas.microsoft.com/office/word/2026/wordml/cei" xmlns:w16cex="http://schemas.microsoft.com/office/word/2018/wordml/cex" xmlns:w16cid="http://schemas.microsoft.com/office/word/2016/wordml/cid" xmlns:w16="http://schemas.microsoft.com/office/word/2018/wordml" xmlns:w16du="http://schemas.microsoft.com/office/word/2023/wordml/word16du" xmlns:w16sdtdh="http://schemas.microsoft.com/office/word/2020/wordml/sdtdatahash" xmlns:w16sdtfl="http://schemas.microsoft.com/office/word/2024/wordml/sdtformatlock" xmlns:w16se="http://schemas.microsoft.com/office/word/2015/wordml/symex" xmlns:wpg="http://schemas.microsoft.com/office/word/2010/wordprocessingGroup" xmlns:wpi="http://schemas.microsoft.com/office/word/2010/wordprocessingInk" xmlns:wne="http://schemas.microsoft.com/office/word/2006/wordml" xmlns:wps="http://schemas.microsoft.com/office/word/2010/wordprocessingShape" mc:Ignorable="w14 w15 w16se w16cid w16 w16cex w16sdtdh w16sdtfl w16du wp14">
+<w:ftr xmlns:wpc="http://schemas.microsoft.com/office/word/2010/wordprocessingCanvas" xmlns:cx="http://schemas.microsoft.com/office/drawing/2014/chartex" xmlns:cx1="http://schemas.microsoft.com/office/drawing/2015/9/8/chartex" xmlns:cx2="http://schemas.microsoft.com/office/drawing/2015/10/21/chartex" xmlns:cx3="http://schemas.microsoft.com/office/drawing/2016/5/9/chartex" xmlns:cx4="http://schemas.microsoft.com/office/drawing/2016/5/10/chartex" xmlns:cx5="http://schemas.microsoft.com/office/drawing/2016/5/11/chartex" xmlns:cx6="http://schemas.microsoft.com/office/drawing/2016/5/12/chartex" xmlns:cx7="http://schemas.microsoft.com/office/drawing/2016/5/13/chartex" xmlns:cx8="http://schemas.microsoft.com/office/drawing/2016/5/14/chartex" xmlns:mc="http://schemas.openxmlformats.org/markup-compatibility/2006" xmlns:aink="http://schemas.microsoft.com/office/drawing/2016/ink" xmlns:am3d="http://schemas.microsoft.com/office/drawing/2017/model3d" xmlns:o="urn:schemas-microsoft-com:office:office" xmlns:oel="http://schemas.microsoft.com/office/2019/extlst" xmlns:r="http://schemas.openxmlformats.org/officeDocument/2006/relationships" xmlns:m="http://schemas.openxmlformats.org/officeDocument/2006/math" xmlns:v="urn:schemas-microsoft-com:vml" xmlns:wp14="http://schemas.microsoft.com/office/word/2010/wordprocessingDrawing" xmlns:wp="http://schemas.openxmlformats.org/drawingml/2006/wordprocessingDrawing" xmlns:w10="urn:schemas-microsoft-com:office:word" xmlns:w="http://schemas.openxmlformats.org/wordprocessingml/2006/main" xmlns:w14="http://schemas.microsoft.com/office/word/2010/wordml" xmlns:w15="http://schemas.microsoft.com/office/word/2012/wordml" xmlns:w16cex="http://schemas.microsoft.com/office/word/2018/wordml/cex" xmlns:w16cid="http://schemas.microsoft.com/office/word/2016/wordml/cid" xmlns:w16="http://schemas.microsoft.com/office/word/2018/wordml" xmlns:w16du="http://schemas.microsoft.com/office/word/2023/wordml/word16du" xmlns:w16sdtdh="http://schemas.microsoft.com/office/word/2020/wordml/sdtdatahash" xmlns:w16sdtfl="http://schemas.microsoft.com/office/word/2024/wordml/sdtformatlock" xmlns:w16se="http://schemas.microsoft.com/office/word/2015/wordml/symex" xmlns:wpg="http://schemas.microsoft.com/office/word/2010/wordprocessingGroup" xmlns:wpi="http://schemas.microsoft.com/office/word/2010/wordprocessingInk" xmlns:wne="http://schemas.microsoft.com/office/word/2006/wordml" xmlns:wps="http://schemas.microsoft.com/office/word/2010/wordprocessingShape" mc:Ignorable="w14 w15 w16se w16cid w16 w16cex w16sdtdh w16sdtfl w16du wp14">
   <w:p>
     <w:pPr>
       <w:pStyle w:val="Footer"/>
@@ -8328,7 +8336,7 @@
 </file>
 
 <file path=word/footer7.xml><?xml version="1.0" encoding="utf-8"?>
-<w:ftr xmlns:wpc="http://schemas.microsoft.com/office/word/2010/wordprocessingCanvas" xmlns:cx="http://schemas.microsoft.com/office/drawing/2014/chartex" xmlns:cx1="http://schemas.microsoft.com/office/drawing/2015/9/8/chartex" xmlns:cx2="http://schemas.microsoft.com/office/drawing/2015/10/21/chartex" xmlns:cx3="http://schemas.microsoft.com/office/drawing/2016/5/9/chartex" xmlns:cx4="http://schemas.microsoft.com/office/drawing/2016/5/10/chartex" xmlns:cx5="http://schemas.microsoft.com/office/drawing/2016/5/11/chartex" xmlns:cx6="http://schemas.microsoft.com/office/drawing/2016/5/12/chartex" xmlns:cx7="http://schemas.microsoft.com/office/drawing/2016/5/13/chartex" xmlns:cx8="http://schemas.microsoft.com/office/drawing/2016/5/14/chartex" xmlns:mc="http://schemas.openxmlformats.org/markup-compatibility/2006" xmlns:aink="http://schemas.microsoft.com/office/drawing/2016/ink" xmlns:am3d="http://schemas.microsoft.com/office/drawing/2017/model3d" xmlns:o="urn:schemas-microsoft-com:office:office" xmlns:oel="http://schemas.microsoft.com/office/2019/extlst" xmlns:r="http://schemas.openxmlformats.org/officeDocument/2006/relationships" xmlns:m="http://schemas.openxmlformats.org/officeDocument/2006/math" xmlns:v="urn:schemas-microsoft-com:vml" xmlns:wp14="http://schemas.microsoft.com/office/word/2010/wordprocessingDrawing" xmlns:wp="http://schemas.openxmlformats.org/drawingml/2006/wordprocessingDrawing" xmlns:w10="urn:schemas-microsoft-com:office:word" xmlns:w="http://schemas.openxmlformats.org/wordprocessingml/2006/main" xmlns:w14="http://schemas.microsoft.com/office/word/2010/wordml" xmlns:w15="http://schemas.microsoft.com/office/word/2012/wordml" xmlns:w16cei="http://schemas.microsoft.com/office/word/2026/wordml/cei" xmlns:w16cex="http://schemas.microsoft.com/office/word/2018/wordml/cex" xmlns:w16cid="http://schemas.microsoft.com/office/word/2016/wordml/cid" xmlns:w16="http://schemas.microsoft.com/office/word/2018/wordml" xmlns:w16du="http://schemas.microsoft.com/office/word/2023/wordml/word16du" xmlns:w16sdtdh="http://schemas.microsoft.com/office/word/2020/wordml/sdtdatahash" xmlns:w16sdtfl="http://schemas.microsoft.com/office/word/2024/wordml/sdtformatlock" xmlns:w16se="http://schemas.microsoft.com/office/word/2015/wordml/symex" xmlns:wpg="http://schemas.microsoft.com/office/word/2010/wordprocessingGroup" xmlns:wpi="http://schemas.microsoft.com/office/word/2010/wordprocessingInk" xmlns:wne="http://schemas.microsoft.com/office/word/2006/wordml" xmlns:wps="http://schemas.microsoft.com/office/word/2010/wordprocessingShape" mc:Ignorable="w14 w15 w16se w16cid w16 w16cex w16sdtdh w16sdtfl w16du wp14">
+<w:ftr xmlns:wpc="http://schemas.microsoft.com/office/word/2010/wordprocessingCanvas" xmlns:cx="http://schemas.microsoft.com/office/drawing/2014/chartex" xmlns:cx1="http://schemas.microsoft.com/office/drawing/2015/9/8/chartex" xmlns:cx2="http://schemas.microsoft.com/office/drawing/2015/10/21/chartex" xmlns:cx3="http://schemas.microsoft.com/office/drawing/2016/5/9/chartex" xmlns:cx4="http://schemas.microsoft.com/office/drawing/2016/5/10/chartex" xmlns:cx5="http://schemas.microsoft.com/office/drawing/2016/5/11/chartex" xmlns:cx6="http://schemas.microsoft.com/office/drawing/2016/5/12/chartex" xmlns:cx7="http://schemas.microsoft.com/office/drawing/2016/5/13/chartex" xmlns:cx8="http://schemas.microsoft.com/office/drawing/2016/5/14/chartex" xmlns:mc="http://schemas.openxmlformats.org/markup-compatibility/2006" xmlns:aink="http://schemas.microsoft.com/office/drawing/2016/ink" xmlns:am3d="http://schemas.microsoft.com/office/drawing/2017/model3d" xmlns:o="urn:schemas-microsoft-com:office:office" xmlns:oel="http://schemas.microsoft.com/office/2019/extlst" xmlns:r="http://schemas.openxmlformats.org/officeDocument/2006/relationships" xmlns:m="http://schemas.openxmlformats.org/officeDocument/2006/math" xmlns:v="urn:schemas-microsoft-com:vml" xmlns:wp14="http://schemas.microsoft.com/office/word/2010/wordprocessingDrawing" xmlns:wp="http://schemas.openxmlformats.org/drawingml/2006/wordprocessingDrawing" xmlns:w10="urn:schemas-microsoft-com:office:word" xmlns:w="http://schemas.openxmlformats.org/wordprocessingml/2006/main" xmlns:w14="http://schemas.microsoft.com/office/word/2010/wordml" xmlns:w15="http://schemas.microsoft.com/office/word/2012/wordml" xmlns:w16cex="http://schemas.microsoft.com/office/word/2018/wordml/cex" xmlns:w16cid="http://schemas.microsoft.com/office/word/2016/wordml/cid" xmlns:w16="http://schemas.microsoft.com/office/word/2018/wordml" xmlns:w16du="http://schemas.microsoft.com/office/word/2023/wordml/word16du" xmlns:w16sdtdh="http://schemas.microsoft.com/office/word/2020/wordml/sdtdatahash" xmlns:w16sdtfl="http://schemas.microsoft.com/office/word/2024/wordml/sdtformatlock" xmlns:w16se="http://schemas.microsoft.com/office/word/2015/wordml/symex" xmlns:wpg="http://schemas.microsoft.com/office/word/2010/wordprocessingGroup" xmlns:wpi="http://schemas.microsoft.com/office/word/2010/wordprocessingInk" xmlns:wne="http://schemas.microsoft.com/office/word/2006/wordml" xmlns:wps="http://schemas.microsoft.com/office/word/2010/wordprocessingShape" mc:Ignorable="w14 w15 w16se w16cid w16 w16cex w16sdtdh w16sdtfl w16du wp14">
   <w:p>
     <w:pPr>
       <w:pStyle w:val="Footer"/>
@@ -8437,7 +8445,7 @@
 </file>
 
 <file path=word/footer8.xml><?xml version="1.0" encoding="utf-8"?>
-<w:ftr xmlns:wpc="http://schemas.microsoft.com/office/word/2010/wordprocessingCanvas" xmlns:cx="http://schemas.microsoft.com/office/drawing/2014/chartex" xmlns:cx1="http://schemas.microsoft.com/office/drawing/2015/9/8/chartex" xmlns:cx2="http://schemas.microsoft.com/office/drawing/2015/10/21/chartex" xmlns:cx3="http://schemas.microsoft.com/office/drawing/2016/5/9/chartex" xmlns:cx4="http://schemas.microsoft.com/office/drawing/2016/5/10/chartex" xmlns:cx5="http://schemas.microsoft.com/office/drawing/2016/5/11/chartex" xmlns:cx6="http://schemas.microsoft.com/office/drawing/2016/5/12/chartex" xmlns:cx7="http://schemas.microsoft.com/office/drawing/2016/5/13/chartex" xmlns:cx8="http://schemas.microsoft.com/office/drawing/2016/5/14/chartex" xmlns:mc="http://schemas.openxmlformats.org/markup-compatibility/2006" xmlns:aink="http://schemas.microsoft.com/office/drawing/2016/ink" xmlns:am3d="http://schemas.microsoft.com/office/drawing/2017/model3d" xmlns:o="urn:schemas-microsoft-com:office:office" xmlns:oel="http://schemas.microsoft.com/office/2019/extlst" xmlns:r="http://schemas.openxmlformats.org/officeDocument/2006/relationships" xmlns:m="http://schemas.openxmlformats.org/officeDocument/2006/math" xmlns:v="urn:schemas-microsoft-com:vml" xmlns:wp14="http://schemas.microsoft.com/office/word/2010/wordprocessingDrawing" xmlns:wp="http://schemas.openxmlformats.org/drawingml/2006/wordprocessingDrawing" xmlns:w10="urn:schemas-microsoft-com:office:word" xmlns:w="http://schemas.openxmlformats.org/wordprocessingml/2006/main" xmlns:w14="http://schemas.microsoft.com/office/word/2010/wordml" xmlns:w15="http://schemas.microsoft.com/office/word/2012/wordml" xmlns:w16cei="http://schemas.microsoft.com/office/word/2026/wordml/cei" xmlns:w16cex="http://schemas.microsoft.com/office/word/2018/wordml/cex" xmlns:w16cid="http://schemas.microsoft.com/office/word/2016/wordml/cid" xmlns:w16="http://schemas.microsoft.com/office/word/2018/wordml" xmlns:w16du="http://schemas.microsoft.com/office/word/2023/wordml/word16du" xmlns:w16sdtdh="http://schemas.microsoft.com/office/word/2020/wordml/sdtdatahash" xmlns:w16sdtfl="http://schemas.microsoft.com/office/word/2024/wordml/sdtformatlock" xmlns:w16se="http://schemas.microsoft.com/office/word/2015/wordml/symex" xmlns:wpg="http://schemas.microsoft.com/office/word/2010/wordprocessingGroup" xmlns:wpi="http://schemas.microsoft.com/office/word/2010/wordprocessingInk" xmlns:wne="http://schemas.microsoft.com/office/word/2006/wordml" xmlns:wps="http://schemas.microsoft.com/office/word/2010/wordprocessingShape" mc:Ignorable="w14 w15 w16se w16cid w16 w16cex w16sdtdh w16sdtfl w16du wp14">
+<w:ftr xmlns:wpc="http://schemas.microsoft.com/office/word/2010/wordprocessingCanvas" xmlns:cx="http://schemas.microsoft.com/office/drawing/2014/chartex" xmlns:cx1="http://schemas.microsoft.com/office/drawing/2015/9/8/chartex" xmlns:cx2="http://schemas.microsoft.com/office/drawing/2015/10/21/chartex" xmlns:cx3="http://schemas.microsoft.com/office/drawing/2016/5/9/chartex" xmlns:cx4="http://schemas.microsoft.com/office/drawing/2016/5/10/chartex" xmlns:cx5="http://schemas.microsoft.com/office/drawing/2016/5/11/chartex" xmlns:cx6="http://schemas.microsoft.com/office/drawing/2016/5/12/chartex" xmlns:cx7="http://schemas.microsoft.com/office/drawing/2016/5/13/chartex" xmlns:cx8="http://schemas.microsoft.com/office/drawing/2016/5/14/chartex" xmlns:mc="http://schemas.openxmlformats.org/markup-compatibility/2006" xmlns:aink="http://schemas.microsoft.com/office/drawing/2016/ink" xmlns:am3d="http://schemas.microsoft.com/office/drawing/2017/model3d" xmlns:o="urn:schemas-microsoft-com:office:office" xmlns:oel="http://schemas.microsoft.com/office/2019/extlst" xmlns:r="http://schemas.openxmlformats.org/officeDocument/2006/relationships" xmlns:m="http://schemas.openxmlformats.org/officeDocument/2006/math" xmlns:v="urn:schemas-microsoft-com:vml" xmlns:wp14="http://schemas.microsoft.com/office/word/2010/wordprocessingDrawing" xmlns:wp="http://schemas.openxmlformats.org/drawingml/2006/wordprocessingDrawing" xmlns:w10="urn:schemas-microsoft-com:office:word" xmlns:w="http://schemas.openxmlformats.org/wordprocessingml/2006/main" xmlns:w14="http://schemas.microsoft.com/office/word/2010/wordml" xmlns:w15="http://schemas.microsoft.com/office/word/2012/wordml" xmlns:w16cex="http://schemas.microsoft.com/office/word/2018/wordml/cex" xmlns:w16cid="http://schemas.microsoft.com/office/word/2016/wordml/cid" xmlns:w16="http://schemas.microsoft.com/office/word/2018/wordml" xmlns:w16du="http://schemas.microsoft.com/office/word/2023/wordml/word16du" xmlns:w16sdtdh="http://schemas.microsoft.com/office/word/2020/wordml/sdtdatahash" xmlns:w16sdtfl="http://schemas.microsoft.com/office/word/2024/wordml/sdtformatlock" xmlns:w16se="http://schemas.microsoft.com/office/word/2015/wordml/symex" xmlns:wpg="http://schemas.microsoft.com/office/word/2010/wordprocessingGroup" xmlns:wpi="http://schemas.microsoft.com/office/word/2010/wordprocessingInk" xmlns:wne="http://schemas.microsoft.com/office/word/2006/wordml" xmlns:wps="http://schemas.microsoft.com/office/word/2010/wordprocessingShape" mc:Ignorable="w14 w15 w16se w16cid w16 w16cex w16sdtdh w16sdtfl w16du wp14">
   <w:p>
     <w:pPr>
       <w:pStyle w:val="Footer"/>
@@ -9090,7 +9098,7 @@
 </file>
 
 <file path=word/footer9.xml><?xml version="1.0" encoding="utf-8"?>
-<w:ftr xmlns:wpc="http://schemas.microsoft.com/office/word/2010/wordprocessingCanvas" xmlns:cx="http://schemas.microsoft.com/office/drawing/2014/chartex" xmlns:cx1="http://schemas.microsoft.com/office/drawing/2015/9/8/chartex" xmlns:cx2="http://schemas.microsoft.com/office/drawing/2015/10/21/chartex" xmlns:cx3="http://schemas.microsoft.com/office/drawing/2016/5/9/chartex" xmlns:cx4="http://schemas.microsoft.com/office/drawing/2016/5/10/chartex" xmlns:cx5="http://schemas.microsoft.com/office/drawing/2016/5/11/chartex" xmlns:cx6="http://schemas.microsoft.com/office/drawing/2016/5/12/chartex" xmlns:cx7="http://schemas.microsoft.com/office/drawing/2016/5/13/chartex" xmlns:cx8="http://schemas.microsoft.com/office/drawing/2016/5/14/chartex" xmlns:mc="http://schemas.openxmlformats.org/markup-compatibility/2006" xmlns:aink="http://schemas.microsoft.com/office/drawing/2016/ink" xmlns:am3d="http://schemas.microsoft.com/office/drawing/2017/model3d" xmlns:o="urn:schemas-microsoft-com:office:office" xmlns:oel="http://schemas.microsoft.com/office/2019/extlst" xmlns:r="http://schemas.openxmlformats.org/officeDocument/2006/relationships" xmlns:m="http://schemas.openxmlformats.org/officeDocument/2006/math" xmlns:v="urn:schemas-microsoft-com:vml" xmlns:wp14="http://schemas.microsoft.com/office/word/2010/wordprocessingDrawing" xmlns:wp="http://schemas.openxmlformats.org/drawingml/2006/wordprocessingDrawing" xmlns:w10="urn:schemas-microsoft-com:office:word" xmlns:w="http://schemas.openxmlformats.org/wordprocessingml/2006/main" xmlns:w14="http://schemas.microsoft.com/office/word/2010/wordml" xmlns:w15="http://schemas.microsoft.com/office/word/2012/wordml" xmlns:w16cei="http://schemas.microsoft.com/office/word/2026/wordml/cei" xmlns:w16cex="http://schemas.microsoft.com/office/word/2018/wordml/cex" xmlns:w16cid="http://schemas.microsoft.com/office/word/2016/wordml/cid" xmlns:w16="http://schemas.microsoft.com/office/word/2018/wordml" xmlns:w16du="http://schemas.microsoft.com/office/word/2023/wordml/word16du" xmlns:w16sdtdh="http://schemas.microsoft.com/office/word/2020/wordml/sdtdatahash" xmlns:w16sdtfl="http://schemas.microsoft.com/office/word/2024/wordml/sdtformatlock" xmlns:w16se="http://schemas.microsoft.com/office/word/2015/wordml/symex" xmlns:wpg="http://schemas.microsoft.com/office/word/2010/wordprocessingGroup" xmlns:wpi="http://schemas.microsoft.com/office/word/2010/wordprocessingInk" xmlns:wne="http://schemas.microsoft.com/office/word/2006/wordml" xmlns:wps="http://schemas.microsoft.com/office/word/2010/wordprocessingShape" mc:Ignorable="w14 w15 w16se w16cid w16 w16cex w16sdtdh w16sdtfl w16du wp14">
+<w:ftr xmlns:wpc="http://schemas.microsoft.com/office/word/2010/wordprocessingCanvas" xmlns:cx="http://schemas.microsoft.com/office/drawing/2014/chartex" xmlns:cx1="http://schemas.microsoft.com/office/drawing/2015/9/8/chartex" xmlns:cx2="http://schemas.microsoft.com/office/drawing/2015/10/21/chartex" xmlns:cx3="http://schemas.microsoft.com/office/drawing/2016/5/9/chartex" xmlns:cx4="http://schemas.microsoft.com/office/drawing/2016/5/10/chartex" xmlns:cx5="http://schemas.microsoft.com/office/drawing/2016/5/11/chartex" xmlns:cx6="http://schemas.microsoft.com/office/drawing/2016/5/12/chartex" xmlns:cx7="http://schemas.microsoft.com/office/drawing/2016/5/13/chartex" xmlns:cx8="http://schemas.microsoft.com/office/drawing/2016/5/14/chartex" xmlns:mc="http://schemas.openxmlformats.org/markup-compatibility/2006" xmlns:aink="http://schemas.microsoft.com/office/drawing/2016/ink" xmlns:am3d="http://schemas.microsoft.com/office/drawing/2017/model3d" xmlns:o="urn:schemas-microsoft-com:office:office" xmlns:oel="http://schemas.microsoft.com/office/2019/extlst" xmlns:r="http://schemas.openxmlformats.org/officeDocument/2006/relationships" xmlns:m="http://schemas.openxmlformats.org/officeDocument/2006/math" xmlns:v="urn:schemas-microsoft-com:vml" xmlns:wp14="http://schemas.microsoft.com/office/word/2010/wordprocessingDrawing" xmlns:wp="http://schemas.openxmlformats.org/drawingml/2006/wordprocessingDrawing" xmlns:w10="urn:schemas-microsoft-com:office:word" xmlns:w="http://schemas.openxmlformats.org/wordprocessingml/2006/main" xmlns:w14="http://schemas.microsoft.com/office/word/2010/wordml" xmlns:w15="http://schemas.microsoft.com/office/word/2012/wordml" xmlns:w16cex="http://schemas.microsoft.com/office/word/2018/wordml/cex" xmlns:w16cid="http://schemas.microsoft.com/office/word/2016/wordml/cid" xmlns:w16="http://schemas.microsoft.com/office/word/2018/wordml" xmlns:w16du="http://schemas.microsoft.com/office/word/2023/wordml/word16du" xmlns:w16sdtdh="http://schemas.microsoft.com/office/word/2020/wordml/sdtdatahash" xmlns:w16sdtfl="http://schemas.microsoft.com/office/word/2024/wordml/sdtformatlock" xmlns:w16se="http://schemas.microsoft.com/office/word/2015/wordml/symex" xmlns:wpg="http://schemas.microsoft.com/office/word/2010/wordprocessingGroup" xmlns:wpi="http://schemas.microsoft.com/office/word/2010/wordprocessingInk" xmlns:wne="http://schemas.microsoft.com/office/word/2006/wordml" xmlns:wps="http://schemas.microsoft.com/office/word/2010/wordprocessingShape" mc:Ignorable="w14 w15 w16se w16cid w16 w16cex w16sdtdh w16sdtfl w16du wp14">
   <w:p>
     <w:pPr>
       <w:pStyle w:val="Footer"/>
@@ -9297,7 +9305,7 @@
 </file>
 
 <file path=word/footnotes.xml><?xml version="1.0" encoding="utf-8"?>
-<w:footnotes xmlns:wpc="http://schemas.microsoft.com/office/word/2010/wordprocessingCanvas" xmlns:cx="http://schemas.microsoft.com/office/drawing/2014/chartex" xmlns:cx1="http://schemas.microsoft.com/office/drawing/2015/9/8/chartex" xmlns:cx2="http://schemas.microsoft.com/office/drawing/2015/10/21/chartex" xmlns:cx3="http://schemas.microsoft.com/office/drawing/2016/5/9/chartex" xmlns:cx4="http://schemas.microsoft.com/office/drawing/2016/5/10/chartex" xmlns:cx5="http://schemas.microsoft.com/office/drawing/2016/5/11/chartex" xmlns:cx6="http://schemas.microsoft.com/office/drawing/2016/5/12/chartex" xmlns:cx7="http://schemas.microsoft.com/office/drawing/2016/5/13/chartex" xmlns:cx8="http://schemas.microsoft.com/office/drawing/2016/5/14/chartex" xmlns:mc="http://schemas.openxmlformats.org/markup-compatibility/2006" xmlns:aink="http://schemas.microsoft.com/office/drawing/2016/ink" xmlns:am3d="http://schemas.microsoft.com/office/drawing/2017/model3d" xmlns:o="urn:schemas-microsoft-com:office:office" xmlns:oel="http://schemas.microsoft.com/office/2019/extlst" xmlns:r="http://schemas.openxmlformats.org/officeDocument/2006/relationships" xmlns:m="http://schemas.openxmlformats.org/officeDocument/2006/math" xmlns:v="urn:schemas-microsoft-com:vml" xmlns:wp14="http://schemas.microsoft.com/office/word/2010/wordprocessingDrawing" xmlns:wp="http://schemas.openxmlformats.org/drawingml/2006/wordprocessingDrawing" xmlns:w10="urn:schemas-microsoft-com:office:word" xmlns:w="http://schemas.openxmlformats.org/wordprocessingml/2006/main" xmlns:w14="http://schemas.microsoft.com/office/word/2010/wordml" xmlns:w15="http://schemas.microsoft.com/office/word/2012/wordml" xmlns:w16cei="http://schemas.microsoft.com/office/word/2026/wordml/cei" xmlns:w16cex="http://schemas.microsoft.com/office/word/2018/wordml/cex" xmlns:w16cid="http://schemas.microsoft.com/office/word/2016/wordml/cid" xmlns:w16="http://schemas.microsoft.com/office/word/2018/wordml" xmlns:w16du="http://schemas.microsoft.com/office/word/2023/wordml/word16du" xmlns:w16sdtdh="http://schemas.microsoft.com/office/word/2020/wordml/sdtdatahash" xmlns:w16sdtfl="http://schemas.microsoft.com/office/word/2024/wordml/sdtformatlock" xmlns:w16se="http://schemas.microsoft.com/office/word/2015/wordml/symex" xmlns:wpg="http://schemas.microsoft.com/office/word/2010/wordprocessingGroup" xmlns:wpi="http://schemas.microsoft.com/office/word/2010/wordprocessingInk" xmlns:wne="http://schemas.microsoft.com/office/word/2006/wordml" xmlns:wps="http://schemas.microsoft.com/office/word/2010/wordprocessingShape" mc:Ignorable="w14 w15 w16se w16cid w16 w16cex w16sdtdh w16sdtfl w16du wp14">
+<w:footnotes xmlns:wpc="http://schemas.microsoft.com/office/word/2010/wordprocessingCanvas" xmlns:cx="http://schemas.microsoft.com/office/drawing/2014/chartex" xmlns:cx1="http://schemas.microsoft.com/office/drawing/2015/9/8/chartex" xmlns:cx2="http://schemas.microsoft.com/office/drawing/2015/10/21/chartex" xmlns:cx3="http://schemas.microsoft.com/office/drawing/2016/5/9/chartex" xmlns:cx4="http://schemas.microsoft.com/office/drawing/2016/5/10/chartex" xmlns:cx5="http://schemas.microsoft.com/office/drawing/2016/5/11/chartex" xmlns:cx6="http://schemas.microsoft.com/office/drawing/2016/5/12/chartex" xmlns:cx7="http://schemas.microsoft.com/office/drawing/2016/5/13/chartex" xmlns:cx8="http://schemas.microsoft.com/office/drawing/2016/5/14/chartex" xmlns:mc="http://schemas.openxmlformats.org/markup-compatibility/2006" xmlns:aink="http://schemas.microsoft.com/office/drawing/2016/ink" xmlns:am3d="http://schemas.microsoft.com/office/drawing/2017/model3d" xmlns:o="urn:schemas-microsoft-com:office:office" xmlns:oel="http://schemas.microsoft.com/office/2019/extlst" xmlns:r="http://schemas.openxmlformats.org/officeDocument/2006/relationships" xmlns:m="http://schemas.openxmlformats.org/officeDocument/2006/math" xmlns:v="urn:schemas-microsoft-com:vml" xmlns:wp14="http://schemas.microsoft.com/office/word/2010/wordprocessingDrawing" xmlns:wp="http://schemas.openxmlformats.org/drawingml/2006/wordprocessingDrawing" xmlns:w10="urn:schemas-microsoft-com:office:word" xmlns:w="http://schemas.openxmlformats.org/wordprocessingml/2006/main" xmlns:w14="http://schemas.microsoft.com/office/word/2010/wordml" xmlns:w15="http://schemas.microsoft.com/office/word/2012/wordml" xmlns:w16cex="http://schemas.microsoft.com/office/word/2018/wordml/cex" xmlns:w16cid="http://schemas.microsoft.com/office/word/2016/wordml/cid" xmlns:w16="http://schemas.microsoft.com/office/word/2018/wordml" xmlns:w16du="http://schemas.microsoft.com/office/word/2023/wordml/word16du" xmlns:w16sdtdh="http://schemas.microsoft.com/office/word/2020/wordml/sdtdatahash" xmlns:w16sdtfl="http://schemas.microsoft.com/office/word/2024/wordml/sdtformatlock" xmlns:w16se="http://schemas.microsoft.com/office/word/2015/wordml/symex" xmlns:wpg="http://schemas.microsoft.com/office/word/2010/wordprocessingGroup" xmlns:wpi="http://schemas.microsoft.com/office/word/2010/wordprocessingInk" xmlns:wne="http://schemas.microsoft.com/office/word/2006/wordml" xmlns:wps="http://schemas.microsoft.com/office/word/2010/wordprocessingShape" mc:Ignorable="w14 w15 w16se w16cid w16 w16cex w16sdtdh w16sdtfl w16du wp14">
   <w:footnote w:type="separator" w:id="-1">
     <w:p>
       <w:r>
@@ -9316,7 +9324,7 @@
 </file>
 
 <file path=word/header1.xml><?xml version="1.0" encoding="utf-8"?>
-<w:hdr xmlns:wpc="http://schemas.microsoft.com/office/word/2010/wordprocessingCanvas" xmlns:cx="http://schemas.microsoft.com/office/drawing/2014/chartex" xmlns:cx1="http://schemas.microsoft.com/office/drawing/2015/9/8/chartex" xmlns:cx2="http://schemas.microsoft.com/office/drawing/2015/10/21/chartex" xmlns:cx3="http://schemas.microsoft.com/office/drawing/2016/5/9/chartex" xmlns:cx4="http://schemas.microsoft.com/office/drawing/2016/5/10/chartex" xmlns:cx5="http://schemas.microsoft.com/office/drawing/2016/5/11/chartex" xmlns:cx6="http://schemas.microsoft.com/office/drawing/2016/5/12/chartex" xmlns:cx7="http://schemas.microsoft.com/office/drawing/2016/5/13/chartex" xmlns:cx8="http://schemas.microsoft.com/office/drawing/2016/5/14/chartex" xmlns:mc="http://schemas.openxmlformats.org/markup-compatibility/2006" xmlns:aink="http://schemas.microsoft.com/office/drawing/2016/ink" xmlns:am3d="http://schemas.microsoft.com/office/drawing/2017/model3d" xmlns:o="urn:schemas-microsoft-com:office:office" xmlns:oel="http://schemas.microsoft.com/office/2019/extlst" xmlns:r="http://schemas.openxmlformats.org/officeDocument/2006/relationships" xmlns:m="http://schemas.openxmlformats.org/officeDocument/2006/math" xmlns:v="urn:schemas-microsoft-com:vml" xmlns:wp14="http://schemas.microsoft.com/office/word/2010/wordprocessingDrawing" xmlns:wp="http://schemas.openxmlformats.org/drawingml/2006/wordprocessingDrawing" xmlns:w10="urn:schemas-microsoft-com:office:word" xmlns:w="http://schemas.openxmlformats.org/wordprocessingml/2006/main" xmlns:w14="http://schemas.microsoft.com/office/word/2010/wordml" xmlns:w15="http://schemas.microsoft.com/office/word/2012/wordml" xmlns:w16cei="http://schemas.microsoft.com/office/word/2026/wordml/cei" xmlns:w16cex="http://schemas.microsoft.com/office/word/2018/wordml/cex" xmlns:w16cid="http://schemas.microsoft.com/office/word/2016/wordml/cid" xmlns:w16="http://schemas.microsoft.com/office/word/2018/wordml" xmlns:w16du="http://schemas.microsoft.com/office/word/2023/wordml/word16du" xmlns:w16sdtdh="http://schemas.microsoft.com/office/word/2020/wordml/sdtdatahash" xmlns:w16sdtfl="http://schemas.microsoft.com/office/word/2024/wordml/sdtformatlock" xmlns:w16se="http://schemas.microsoft.com/office/word/2015/wordml/symex" xmlns:wpg="http://schemas.microsoft.com/office/word/2010/wordprocessingGroup" xmlns:wpi="http://schemas.microsoft.com/office/word/2010/wordprocessingInk" xmlns:wne="http://schemas.microsoft.com/office/word/2006/wordml" xmlns:wps="http://schemas.microsoft.com/office/word/2010/wordprocessingShape" mc:Ignorable="w14 w15 w16se w16cid w16 w16cex w16sdtdh w16sdtfl w16du wp14">
+<w:hdr xmlns:wpc="http://schemas.microsoft.com/office/word/2010/wordprocessingCanvas" xmlns:cx="http://schemas.microsoft.com/office/drawing/2014/chartex" xmlns:cx1="http://schemas.microsoft.com/office/drawing/2015/9/8/chartex" xmlns:cx2="http://schemas.microsoft.com/office/drawing/2015/10/21/chartex" xmlns:cx3="http://schemas.microsoft.com/office/drawing/2016/5/9/chartex" xmlns:cx4="http://schemas.microsoft.com/office/drawing/2016/5/10/chartex" xmlns:cx5="http://schemas.microsoft.com/office/drawing/2016/5/11/chartex" xmlns:cx6="http://schemas.microsoft.com/office/drawing/2016/5/12/chartex" xmlns:cx7="http://schemas.microsoft.com/office/drawing/2016/5/13/chartex" xmlns:cx8="http://schemas.microsoft.com/office/drawing/2016/5/14/chartex" xmlns:mc="http://schemas.openxmlformats.org/markup-compatibility/2006" xmlns:aink="http://schemas.microsoft.com/office/drawing/2016/ink" xmlns:am3d="http://schemas.microsoft.com/office/drawing/2017/model3d" xmlns:o="urn:schemas-microsoft-com:office:office" xmlns:oel="http://schemas.microsoft.com/office/2019/extlst" xmlns:r="http://schemas.openxmlformats.org/officeDocument/2006/relationships" xmlns:m="http://schemas.openxmlformats.org/officeDocument/2006/math" xmlns:v="urn:schemas-microsoft-com:vml" xmlns:wp14="http://schemas.microsoft.com/office/word/2010/wordprocessingDrawing" xmlns:wp="http://schemas.openxmlformats.org/drawingml/2006/wordprocessingDrawing" xmlns:w10="urn:schemas-microsoft-com:office:word" xmlns:w="http://schemas.openxmlformats.org/wordprocessingml/2006/main" xmlns:w14="http://schemas.microsoft.com/office/word/2010/wordml" xmlns:w15="http://schemas.microsoft.com/office/word/2012/wordml" xmlns:w16cex="http://schemas.microsoft.com/office/word/2018/wordml/cex" xmlns:w16cid="http://schemas.microsoft.com/office/word/2016/wordml/cid" xmlns:w16="http://schemas.microsoft.com/office/word/2018/wordml" xmlns:w16du="http://schemas.microsoft.com/office/word/2023/wordml/word16du" xmlns:w16sdtdh="http://schemas.microsoft.com/office/word/2020/wordml/sdtdatahash" xmlns:w16sdtfl="http://schemas.microsoft.com/office/word/2024/wordml/sdtformatlock" xmlns:w16se="http://schemas.microsoft.com/office/word/2015/wordml/symex" xmlns:wpg="http://schemas.microsoft.com/office/word/2010/wordprocessingGroup" xmlns:wpi="http://schemas.microsoft.com/office/word/2010/wordprocessingInk" xmlns:wne="http://schemas.microsoft.com/office/word/2006/wordml" xmlns:wps="http://schemas.microsoft.com/office/word/2010/wordprocessingShape" mc:Ignorable="w14 w15 w16se w16cid w16 w16cex w16sdtdh w16sdtfl w16du wp14">
   <w:p>
     <w:pPr>
       <w:pStyle w:val="Header"/>
@@ -9374,7 +9382,7 @@
 </file>
 
 <file path=word/header2.xml><?xml version="1.0" encoding="utf-8"?>
-<w:hdr xmlns:wpc="http://schemas.microsoft.com/office/word/2010/wordprocessingCanvas" xmlns:cx="http://schemas.microsoft.com/office/drawing/2014/chartex" xmlns:cx1="http://schemas.microsoft.com/office/drawing/2015/9/8/chartex" xmlns:cx2="http://schemas.microsoft.com/office/drawing/2015/10/21/chartex" xmlns:cx3="http://schemas.microsoft.com/office/drawing/2016/5/9/chartex" xmlns:cx4="http://schemas.microsoft.com/office/drawing/2016/5/10/chartex" xmlns:cx5="http://schemas.microsoft.com/office/drawing/2016/5/11/chartex" xmlns:cx6="http://schemas.microsoft.com/office/drawing/2016/5/12/chartex" xmlns:cx7="http://schemas.microsoft.com/office/drawing/2016/5/13/chartex" xmlns:cx8="http://schemas.microsoft.com/office/drawing/2016/5/14/chartex" xmlns:mc="http://schemas.openxmlformats.org/markup-compatibility/2006" xmlns:aink="http://schemas.microsoft.com/office/drawing/2016/ink" xmlns:am3d="http://schemas.microsoft.com/office/drawing/2017/model3d" xmlns:o="urn:schemas-microsoft-com:office:office" xmlns:oel="http://schemas.microsoft.com/office/2019/extlst" xmlns:r="http://schemas.openxmlformats.org/officeDocument/2006/relationships" xmlns:m="http://schemas.openxmlformats.org/officeDocument/2006/math" xmlns:v="urn:schemas-microsoft-com:vml" xmlns:wp14="http://schemas.microsoft.com/office/word/2010/wordprocessingDrawing" xmlns:wp="http://schemas.openxmlformats.org/drawingml/2006/wordprocessingDrawing" xmlns:w10="urn:schemas-microsoft-com:office:word" xmlns:w="http://schemas.openxmlformats.org/wordprocessingml/2006/main" xmlns:w14="http://schemas.microsoft.com/office/word/2010/wordml" xmlns:w15="http://schemas.microsoft.com/office/word/2012/wordml" xmlns:w16cei="http://schemas.microsoft.com/office/word/2026/wordml/cei" xmlns:w16cex="http://schemas.microsoft.com/office/word/2018/wordml/cex" xmlns:w16cid="http://schemas.microsoft.com/office/word/2016/wordml/cid" xmlns:w16="http://schemas.microsoft.com/office/word/2018/wordml" xmlns:w16du="http://schemas.microsoft.com/office/word/2023/wordml/word16du" xmlns:w16sdtdh="http://schemas.microsoft.com/office/word/2020/wordml/sdtdatahash" xmlns:w16sdtfl="http://schemas.microsoft.com/office/word/2024/wordml/sdtformatlock" xmlns:w16se="http://schemas.microsoft.com/office/word/2015/wordml/symex" xmlns:wpg="http://schemas.microsoft.com/office/word/2010/wordprocessingGroup" xmlns:wpi="http://schemas.microsoft.com/office/word/2010/wordprocessingInk" xmlns:wne="http://schemas.microsoft.com/office/word/2006/wordml" xmlns:wps="http://schemas.microsoft.com/office/word/2010/wordprocessingShape" mc:Ignorable="w14 w15 w16se w16cid w16 w16cex w16sdtdh w16sdtfl w16du wp14">
+<w:hdr xmlns:wpc="http://schemas.microsoft.com/office/word/2010/wordprocessingCanvas" xmlns:cx="http://schemas.microsoft.com/office/drawing/2014/chartex" xmlns:cx1="http://schemas.microsoft.com/office/drawing/2015/9/8/chartex" xmlns:cx2="http://schemas.microsoft.com/office/drawing/2015/10/21/chartex" xmlns:cx3="http://schemas.microsoft.com/office/drawing/2016/5/9/chartex" xmlns:cx4="http://schemas.microsoft.com/office/drawing/2016/5/10/chartex" xmlns:cx5="http://schemas.microsoft.com/office/drawing/2016/5/11/chartex" xmlns:cx6="http://schemas.microsoft.com/office/drawing/2016/5/12/chartex" xmlns:cx7="http://schemas.microsoft.com/office/drawing/2016/5/13/chartex" xmlns:cx8="http://schemas.microsoft.com/office/drawing/2016/5/14/chartex" xmlns:mc="http://schemas.openxmlformats.org/markup-compatibility/2006" xmlns:aink="http://schemas.microsoft.com/office/drawing/2016/ink" xmlns:am3d="http://schemas.microsoft.com/office/drawing/2017/model3d" xmlns:o="urn:schemas-microsoft-com:office:office" xmlns:oel="http://schemas.microsoft.com/office/2019/extlst" xmlns:r="http://schemas.openxmlformats.org/officeDocument/2006/relationships" xmlns:m="http://schemas.openxmlformats.org/officeDocument/2006/math" xmlns:v="urn:schemas-microsoft-com:vml" xmlns:wp14="http://schemas.microsoft.com/office/word/2010/wordprocessingDrawing" xmlns:wp="http://schemas.openxmlformats.org/drawingml/2006/wordprocessingDrawing" xmlns:w10="urn:schemas-microsoft-com:office:word" xmlns:w="http://schemas.openxmlformats.org/wordprocessingml/2006/main" xmlns:w14="http://schemas.microsoft.com/office/word/2010/wordml" xmlns:w15="http://schemas.microsoft.com/office/word/2012/wordml" xmlns:w16cex="http://schemas.microsoft.com/office/word/2018/wordml/cex" xmlns:w16cid="http://schemas.microsoft.com/office/word/2016/wordml/cid" xmlns:w16="http://schemas.microsoft.com/office/word/2018/wordml" xmlns:w16du="http://schemas.microsoft.com/office/word/2023/wordml/word16du" xmlns:w16sdtdh="http://schemas.microsoft.com/office/word/2020/wordml/sdtdatahash" xmlns:w16sdtfl="http://schemas.microsoft.com/office/word/2024/wordml/sdtformatlock" xmlns:w16se="http://schemas.microsoft.com/office/word/2015/wordml/symex" xmlns:wpg="http://schemas.microsoft.com/office/word/2010/wordprocessingGroup" xmlns:wpi="http://schemas.microsoft.com/office/word/2010/wordprocessingInk" xmlns:wne="http://schemas.microsoft.com/office/word/2006/wordml" xmlns:wps="http://schemas.microsoft.com/office/word/2010/wordprocessingShape" mc:Ignorable="w14 w15 w16se w16cid w16 w16cex w16sdtdh w16sdtfl w16du wp14">
   <w:p>
     <w:pPr>
       <w:pStyle w:val="Header"/>
@@ -9433,7 +9441,7 @@
 </file>
 
 <file path=word/header3.xml><?xml version="1.0" encoding="utf-8"?>
-<w:hdr xmlns:wpc="http://schemas.microsoft.com/office/word/2010/wordprocessingCanvas" xmlns:cx="http://schemas.microsoft.com/office/drawing/2014/chartex" xmlns:cx1="http://schemas.microsoft.com/office/drawing/2015/9/8/chartex" xmlns:cx2="http://schemas.microsoft.com/office/drawing/2015/10/21/chartex" xmlns:cx3="http://schemas.microsoft.com/office/drawing/2016/5/9/chartex" xmlns:cx4="http://schemas.microsoft.com/office/drawing/2016/5/10/chartex" xmlns:cx5="http://schemas.microsoft.com/office/drawing/2016/5/11/chartex" xmlns:cx6="http://schemas.microsoft.com/office/drawing/2016/5/12/chartex" xmlns:cx7="http://schemas.microsoft.com/office/drawing/2016/5/13/chartex" xmlns:cx8="http://schemas.microsoft.com/office/drawing/2016/5/14/chartex" xmlns:mc="http://schemas.openxmlformats.org/markup-compatibility/2006" xmlns:aink="http://schemas.microsoft.com/office/drawing/2016/ink" xmlns:am3d="http://schemas.microsoft.com/office/drawing/2017/model3d" xmlns:o="urn:schemas-microsoft-com:office:office" xmlns:oel="http://schemas.microsoft.com/office/2019/extlst" xmlns:r="http://schemas.openxmlformats.org/officeDocument/2006/relationships" xmlns:m="http://schemas.openxmlformats.org/officeDocument/2006/math" xmlns:v="urn:schemas-microsoft-com:vml" xmlns:wp14="http://schemas.microsoft.com/office/word/2010/wordprocessingDrawing" xmlns:wp="http://schemas.openxmlformats.org/drawingml/2006/wordprocessingDrawing" xmlns:w10="urn:schemas-microsoft-com:office:word" xmlns:w="http://schemas.openxmlformats.org/wordprocessingml/2006/main" xmlns:w14="http://schemas.microsoft.com/office/word/2010/wordml" xmlns:w15="http://schemas.microsoft.com/office/word/2012/wordml" xmlns:w16cei="http://schemas.microsoft.com/office/word/2026/wordml/cei" xmlns:w16cex="http://schemas.microsoft.com/office/word/2018/wordml/cex" xmlns:w16cid="http://schemas.microsoft.com/office/word/2016/wordml/cid" xmlns:w16="http://schemas.microsoft.com/office/word/2018/wordml" xmlns:w16du="http://schemas.microsoft.com/office/word/2023/wordml/word16du" xmlns:w16sdtdh="http://schemas.microsoft.com/office/word/2020/wordml/sdtdatahash" xmlns:w16sdtfl="http://schemas.microsoft.com/office/word/2024/wordml/sdtformatlock" xmlns:w16se="http://schemas.microsoft.com/office/word/2015/wordml/symex" xmlns:wpg="http://schemas.microsoft.com/office/word/2010/wordprocessingGroup" xmlns:wpi="http://schemas.microsoft.com/office/word/2010/wordprocessingInk" xmlns:wne="http://schemas.microsoft.com/office/word/2006/wordml" xmlns:wps="http://schemas.microsoft.com/office/word/2010/wordprocessingShape" mc:Ignorable="w14 w15 w16se w16cid w16 w16cex w16sdtdh w16sdtfl w16du wp14">
+<w:hdr xmlns:wpc="http://schemas.microsoft.com/office/word/2010/wordprocessingCanvas" xmlns:cx="http://schemas.microsoft.com/office/drawing/2014/chartex" xmlns:cx1="http://schemas.microsoft.com/office/drawing/2015/9/8/chartex" xmlns:cx2="http://schemas.microsoft.com/office/drawing/2015/10/21/chartex" xmlns:cx3="http://schemas.microsoft.com/office/drawing/2016/5/9/chartex" xmlns:cx4="http://schemas.microsoft.com/office/drawing/2016/5/10/chartex" xmlns:cx5="http://schemas.microsoft.com/office/drawing/2016/5/11/chartex" xmlns:cx6="http://schemas.microsoft.com/office/drawing/2016/5/12/chartex" xmlns:cx7="http://schemas.microsoft.com/office/drawing/2016/5/13/chartex" xmlns:cx8="http://schemas.microsoft.com/office/drawing/2016/5/14/chartex" xmlns:mc="http://schemas.openxmlformats.org/markup-compatibility/2006" xmlns:aink="http://schemas.microsoft.com/office/drawing/2016/ink" xmlns:am3d="http://schemas.microsoft.com/office/drawing/2017/model3d" xmlns:o="urn:schemas-microsoft-com:office:office" xmlns:oel="http://schemas.microsoft.com/office/2019/extlst" xmlns:r="http://schemas.openxmlformats.org/officeDocument/2006/relationships" xmlns:m="http://schemas.openxmlformats.org/officeDocument/2006/math" xmlns:v="urn:schemas-microsoft-com:vml" xmlns:wp14="http://schemas.microsoft.com/office/word/2010/wordprocessingDrawing" xmlns:wp="http://schemas.openxmlformats.org/drawingml/2006/wordprocessingDrawing" xmlns:w10="urn:schemas-microsoft-com:office:word" xmlns:w="http://schemas.openxmlformats.org/wordprocessingml/2006/main" xmlns:w14="http://schemas.microsoft.com/office/word/2010/wordml" xmlns:w15="http://schemas.microsoft.com/office/word/2012/wordml" xmlns:w16cex="http://schemas.microsoft.com/office/word/2018/wordml/cex" xmlns:w16cid="http://schemas.microsoft.com/office/word/2016/wordml/cid" xmlns:w16="http://schemas.microsoft.com/office/word/2018/wordml" xmlns:w16du="http://schemas.microsoft.com/office/word/2023/wordml/word16du" xmlns:w16sdtdh="http://schemas.microsoft.com/office/word/2020/wordml/sdtdatahash" xmlns:w16sdtfl="http://schemas.microsoft.com/office/word/2024/wordml/sdtformatlock" xmlns:w16se="http://schemas.microsoft.com/office/word/2015/wordml/symex" xmlns:wpg="http://schemas.microsoft.com/office/word/2010/wordprocessingGroup" xmlns:wpi="http://schemas.microsoft.com/office/word/2010/wordprocessingInk" xmlns:wne="http://schemas.microsoft.com/office/word/2006/wordml" xmlns:wps="http://schemas.microsoft.com/office/word/2010/wordprocessingShape" mc:Ignorable="w14 w15 w16se w16cid w16 w16cex w16sdtdh w16sdtfl w16du wp14">
   <w:p>
     <w:pPr>
       <w:pStyle w:val="Header"/>
@@ -9491,7 +9499,7 @@
 </file>
 
 <file path=word/header4.xml><?xml version="1.0" encoding="utf-8"?>
-<w:hdr xmlns:wpc="http://schemas.microsoft.com/office/word/2010/wordprocessingCanvas" xmlns:cx="http://schemas.microsoft.com/office/drawing/2014/chartex" xmlns:cx1="http://schemas.microsoft.com/office/drawing/2015/9/8/chartex" xmlns:cx2="http://schemas.microsoft.com/office/drawing/2015/10/21/chartex" xmlns:cx3="http://schemas.microsoft.com/office/drawing/2016/5/9/chartex" xmlns:cx4="http://schemas.microsoft.com/office/drawing/2016/5/10/chartex" xmlns:cx5="http://schemas.microsoft.com/office/drawing/2016/5/11/chartex" xmlns:cx6="http://schemas.microsoft.com/office/drawing/2016/5/12/chartex" xmlns:cx7="http://schemas.microsoft.com/office/drawing/2016/5/13/chartex" xmlns:cx8="http://schemas.microsoft.com/office/drawing/2016/5/14/chartex" xmlns:mc="http://schemas.openxmlformats.org/markup-compatibility/2006" xmlns:aink="http://schemas.microsoft.com/office/drawing/2016/ink" xmlns:am3d="http://schemas.microsoft.com/office/drawing/2017/model3d" xmlns:o="urn:schemas-microsoft-com:office:office" xmlns:oel="http://schemas.microsoft.com/office/2019/extlst" xmlns:r="http://schemas.openxmlformats.org/officeDocument/2006/relationships" xmlns:m="http://schemas.openxmlformats.org/officeDocument/2006/math" xmlns:v="urn:schemas-microsoft-com:vml" xmlns:wp14="http://schemas.microsoft.com/office/word/2010/wordprocessingDrawing" xmlns:wp="http://schemas.openxmlformats.org/drawingml/2006/wordprocessingDrawing" xmlns:w10="urn:schemas-microsoft-com:office:word" xmlns:w="http://schemas.openxmlformats.org/wordprocessingml/2006/main" xmlns:w14="http://schemas.microsoft.com/office/word/2010/wordml" xmlns:w15="http://schemas.microsoft.com/office/word/2012/wordml" xmlns:w16cei="http://schemas.microsoft.com/office/word/2026/wordml/cei" xmlns:w16cex="http://schemas.microsoft.com/office/word/2018/wordml/cex" xmlns:w16cid="http://schemas.microsoft.com/office/word/2016/wordml/cid" xmlns:w16="http://schemas.microsoft.com/office/word/2018/wordml" xmlns:w16du="http://schemas.microsoft.com/office/word/2023/wordml/word16du" xmlns:w16sdtdh="http://schemas.microsoft.com/office/word/2020/wordml/sdtdatahash" xmlns:w16sdtfl="http://schemas.microsoft.com/office/word/2024/wordml/sdtformatlock" xmlns:w16se="http://schemas.microsoft.com/office/word/2015/wordml/symex" xmlns:wpg="http://schemas.microsoft.com/office/word/2010/wordprocessingGroup" xmlns:wpi="http://schemas.microsoft.com/office/word/2010/wordprocessingInk" xmlns:wne="http://schemas.microsoft.com/office/word/2006/wordml" xmlns:wps="http://schemas.microsoft.com/office/word/2010/wordprocessingShape" mc:Ignorable="w14 w15 w16se w16cid w16 w16cex w16sdtdh w16sdtfl w16du wp14">
+<w:hdr xmlns:wpc="http://schemas.microsoft.com/office/word/2010/wordprocessingCanvas" xmlns:cx="http://schemas.microsoft.com/office/drawing/2014/chartex" xmlns:cx1="http://schemas.microsoft.com/office/drawing/2015/9/8/chartex" xmlns:cx2="http://schemas.microsoft.com/office/drawing/2015/10/21/chartex" xmlns:cx3="http://schemas.microsoft.com/office/drawing/2016/5/9/chartex" xmlns:cx4="http://schemas.microsoft.com/office/drawing/2016/5/10/chartex" xmlns:cx5="http://schemas.microsoft.com/office/drawing/2016/5/11/chartex" xmlns:cx6="http://schemas.microsoft.com/office/drawing/2016/5/12/chartex" xmlns:cx7="http://schemas.microsoft.com/office/drawing/2016/5/13/chartex" xmlns:cx8="http://schemas.microsoft.com/office/drawing/2016/5/14/chartex" xmlns:mc="http://schemas.openxmlformats.org/markup-compatibility/2006" xmlns:aink="http://schemas.microsoft.com/office/drawing/2016/ink" xmlns:am3d="http://schemas.microsoft.com/office/drawing/2017/model3d" xmlns:o="urn:schemas-microsoft-com:office:office" xmlns:oel="http://schemas.microsoft.com/office/2019/extlst" xmlns:r="http://schemas.openxmlformats.org/officeDocument/2006/relationships" xmlns:m="http://schemas.openxmlformats.org/officeDocument/2006/math" xmlns:v="urn:schemas-microsoft-com:vml" xmlns:wp14="http://schemas.microsoft.com/office/word/2010/wordprocessingDrawing" xmlns:wp="http://schemas.openxmlformats.org/drawingml/2006/wordprocessingDrawing" xmlns:w10="urn:schemas-microsoft-com:office:word" xmlns:w="http://schemas.openxmlformats.org/wordprocessingml/2006/main" xmlns:w14="http://schemas.microsoft.com/office/word/2010/wordml" xmlns:w15="http://schemas.microsoft.com/office/word/2012/wordml" xmlns:w16cex="http://schemas.microsoft.com/office/word/2018/wordml/cex" xmlns:w16cid="http://schemas.microsoft.com/office/word/2016/wordml/cid" xmlns:w16="http://schemas.microsoft.com/office/word/2018/wordml" xmlns:w16du="http://schemas.microsoft.com/office/word/2023/wordml/word16du" xmlns:w16sdtdh="http://schemas.microsoft.com/office/word/2020/wordml/sdtdatahash" xmlns:w16sdtfl="http://schemas.microsoft.com/office/word/2024/wordml/sdtformatlock" xmlns:w16se="http://schemas.microsoft.com/office/word/2015/wordml/symex" xmlns:wpg="http://schemas.microsoft.com/office/word/2010/wordprocessingGroup" xmlns:wpi="http://schemas.microsoft.com/office/word/2010/wordprocessingInk" xmlns:wne="http://schemas.microsoft.com/office/word/2006/wordml" xmlns:wps="http://schemas.microsoft.com/office/word/2010/wordprocessingShape" mc:Ignorable="w14 w15 w16se w16cid w16 w16cex w16sdtdh w16sdtfl w16du wp14">
   <w:tbl>
     <w:tblPr>
       <w:tblW w:w="0" w:type="auto"/>
@@ -9553,7 +9561,7 @@
 </file>
 
 <file path=word/numbering.xml><?xml version="1.0" encoding="utf-8"?>
-<w:numbering xmlns:wpc="http://schemas.microsoft.com/office/word/2010/wordprocessingCanvas" xmlns:cx="http://schemas.microsoft.com/office/drawing/2014/chartex" xmlns:cx1="http://schemas.microsoft.com/office/drawing/2015/9/8/chartex" xmlns:cx2="http://schemas.microsoft.com/office/drawing/2015/10/21/chartex" xmlns:cx3="http://schemas.microsoft.com/office/drawing/2016/5/9/chartex" xmlns:cx4="http://schemas.microsoft.com/office/drawing/2016/5/10/chartex" xmlns:cx5="http://schemas.microsoft.com/office/drawing/2016/5/11/chartex" xmlns:cx6="http://schemas.microsoft.com/office/drawing/2016/5/12/chartex" xmlns:cx7="http://schemas.microsoft.com/office/drawing/2016/5/13/chartex" xmlns:cx8="http://schemas.microsoft.com/office/drawing/2016/5/14/chartex" xmlns:mc="http://schemas.openxmlformats.org/markup-compatibility/2006" xmlns:aink="http://schemas.microsoft.com/office/drawing/2016/ink" xmlns:am3d="http://schemas.microsoft.com/office/drawing/2017/model3d" xmlns:o="urn:schemas-microsoft-com:office:office" xmlns:oel="http://schemas.microsoft.com/office/2019/extlst" xmlns:r="http://schemas.openxmlformats.org/officeDocument/2006/relationships" xmlns:m="http://schemas.openxmlformats.org/officeDocument/2006/math" xmlns:v="urn:schemas-microsoft-com:vml" xmlns:wp14="http://schemas.microsoft.com/office/word/2010/wordprocessingDrawing" xmlns:wp="http://schemas.openxmlformats.org/drawingml/2006/wordprocessingDrawing" xmlns:w10="urn:schemas-microsoft-com:office:word" xmlns:w="http://schemas.openxmlformats.org/wordprocessingml/2006/main" xmlns:w14="http://schemas.microsoft.com/office/word/2010/wordml" xmlns:w15="http://schemas.microsoft.com/office/word/2012/wordml" xmlns:w16cei="http://schemas.microsoft.com/office/word/2026/wordml/cei" xmlns:w16cex="http://schemas.microsoft.com/office/word/2018/wordml/cex" xmlns:w16cid="http://schemas.microsoft.com/office/word/2016/wordml/cid" xmlns:w16="http://schemas.microsoft.com/office/word/2018/wordml" xmlns:w16du="http://schemas.microsoft.com/office/word/2023/wordml/word16du" xmlns:w16sdtdh="http://schemas.microsoft.com/office/word/2020/wordml/sdtdatahash" xmlns:w16sdtfl="http://schemas.microsoft.com/office/word/2024/wordml/sdtformatlock" xmlns:w16se="http://schemas.microsoft.com/office/word/2015/wordml/symex" xmlns:wpg="http://schemas.microsoft.com/office/word/2010/wordprocessingGroup" xmlns:wpi="http://schemas.microsoft.com/office/word/2010/wordprocessingInk" xmlns:wne="http://schemas.microsoft.com/office/word/2006/wordml" xmlns:wps="http://schemas.microsoft.com/office/word/2010/wordprocessingShape" mc:Ignorable="w14 w15 w16se w16cid w16 w16cex w16sdtdh w16sdtfl w16du wp14">
+<w:numbering xmlns:wpc="http://schemas.microsoft.com/office/word/2010/wordprocessingCanvas" xmlns:cx="http://schemas.microsoft.com/office/drawing/2014/chartex" xmlns:cx1="http://schemas.microsoft.com/office/drawing/2015/9/8/chartex" xmlns:cx2="http://schemas.microsoft.com/office/drawing/2015/10/21/chartex" xmlns:cx3="http://schemas.microsoft.com/office/drawing/2016/5/9/chartex" xmlns:cx4="http://schemas.microsoft.com/office/drawing/2016/5/10/chartex" xmlns:cx5="http://schemas.microsoft.com/office/drawing/2016/5/11/chartex" xmlns:cx6="http://schemas.microsoft.com/office/drawing/2016/5/12/chartex" xmlns:cx7="http://schemas.microsoft.com/office/drawing/2016/5/13/chartex" xmlns:cx8="http://schemas.microsoft.com/office/drawing/2016/5/14/chartex" xmlns:mc="http://schemas.openxmlformats.org/markup-compatibility/2006" xmlns:aink="http://schemas.microsoft.com/office/drawing/2016/ink" xmlns:am3d="http://schemas.microsoft.com/office/drawing/2017/model3d" xmlns:o="urn:schemas-microsoft-com:office:office" xmlns:oel="http://schemas.microsoft.com/office/2019/extlst" xmlns:r="http://schemas.openxmlformats.org/officeDocument/2006/relationships" xmlns:m="http://schemas.openxmlformats.org/officeDocument/2006/math" xmlns:v="urn:schemas-microsoft-com:vml" xmlns:wp14="http://schemas.microsoft.com/office/word/2010/wordprocessingDrawing" xmlns:wp="http://schemas.openxmlformats.org/drawingml/2006/wordprocessingDrawing" xmlns:w10="urn:schemas-microsoft-com:office:word" xmlns:w="http://schemas.openxmlformats.org/wordprocessingml/2006/main" xmlns:w14="http://schemas.microsoft.com/office/word/2010/wordml" xmlns:w15="http://schemas.microsoft.com/office/word/2012/wordml" xmlns:w16cex="http://schemas.microsoft.com/office/word/2018/wordml/cex" xmlns:w16cid="http://schemas.microsoft.com/office/word/2016/wordml/cid" xmlns:w16="http://schemas.microsoft.com/office/word/2018/wordml" xmlns:w16du="http://schemas.microsoft.com/office/word/2023/wordml/word16du" xmlns:w16sdtdh="http://schemas.microsoft.com/office/word/2020/wordml/sdtdatahash" xmlns:w16sdtfl="http://schemas.microsoft.com/office/word/2024/wordml/sdtformatlock" xmlns:w16se="http://schemas.microsoft.com/office/word/2015/wordml/symex" xmlns:wpg="http://schemas.microsoft.com/office/word/2010/wordprocessingGroup" xmlns:wpi="http://schemas.microsoft.com/office/word/2010/wordprocessingInk" xmlns:wne="http://schemas.microsoft.com/office/word/2006/wordml" xmlns:wps="http://schemas.microsoft.com/office/word/2010/wordprocessingShape" mc:Ignorable="w14 w15 w16se w16cid w16 w16cex w16sdtdh w16sdtfl w16du wp14">
   <w:abstractNum w:abstractNumId="0" w15:restartNumberingAfterBreak="0">
     <w:nsid w:val="FFFFFF83"/>
     <w:multiLevelType w:val="singleLevel"/>
@@ -12603,7 +12611,7 @@
 </file>
 
 <file path=word/glossary/document.xml><?xml version="1.0" encoding="utf-8"?>
-<w:glossaryDocument xmlns:wpc="http://schemas.microsoft.com/office/word/2010/wordprocessingCanvas" xmlns:cx="http://schemas.microsoft.com/office/drawing/2014/chartex" xmlns:cx1="http://schemas.microsoft.com/office/drawing/2015/9/8/chartex" xmlns:cx2="http://schemas.microsoft.com/office/drawing/2015/10/21/chartex" xmlns:cx3="http://schemas.microsoft.com/office/drawing/2016/5/9/chartex" xmlns:cx4="http://schemas.microsoft.com/office/drawing/2016/5/10/chartex" xmlns:cx5="http://schemas.microsoft.com/office/drawing/2016/5/11/chartex" xmlns:cx6="http://schemas.microsoft.com/office/drawing/2016/5/12/chartex" xmlns:cx7="http://schemas.microsoft.com/office/drawing/2016/5/13/chartex" xmlns:cx8="http://schemas.microsoft.com/office/drawing/2016/5/14/chartex" xmlns:mc="http://schemas.openxmlformats.org/markup-compatibility/2006" xmlns:aink="http://schemas.microsoft.com/office/drawing/2016/ink" xmlns:am3d="http://schemas.microsoft.com/office/drawing/2017/model3d" xmlns:o="urn:schemas-microsoft-com:office:office" xmlns:oel="http://schemas.microsoft.com/office/2019/extlst" xmlns:r="http://schemas.openxmlformats.org/officeDocument/2006/relationships" xmlns:m="http://schemas.openxmlformats.org/officeDocument/2006/math" xmlns:v="urn:schemas-microsoft-com:vml" xmlns:wp14="http://schemas.microsoft.com/office/word/2010/wordprocessingDrawing" xmlns:wp="http://schemas.openxmlformats.org/drawingml/2006/wordprocessingDrawing" xmlns:w10="urn:schemas-microsoft-com:office:word" xmlns:w="http://schemas.openxmlformats.org/wordprocessingml/2006/main" xmlns:w14="http://schemas.microsoft.com/office/word/2010/wordml" xmlns:w15="http://schemas.microsoft.com/office/word/2012/wordml" xmlns:w16cei="http://schemas.microsoft.com/office/word/2026/wordml/cei" xmlns:w16cex="http://schemas.microsoft.com/office/word/2018/wordml/cex" xmlns:w16cid="http://schemas.microsoft.com/office/word/2016/wordml/cid" xmlns:w16="http://schemas.microsoft.com/office/word/2018/wordml" xmlns:w16du="http://schemas.microsoft.com/office/word/2023/wordml/word16du" xmlns:w16sdtdh="http://schemas.microsoft.com/office/word/2020/wordml/sdtdatahash" xmlns:w16sdtfl="http://schemas.microsoft.com/office/word/2024/wordml/sdtformatlock" xmlns:w16se="http://schemas.microsoft.com/office/word/2015/wordml/symex" xmlns:wpg="http://schemas.microsoft.com/office/word/2010/wordprocessingGroup" xmlns:wpi="http://schemas.microsoft.com/office/word/2010/wordprocessingInk" xmlns:wne="http://schemas.microsoft.com/office/word/2006/wordml" xmlns:wps="http://schemas.microsoft.com/office/word/2010/wordprocessingShape" mc:Ignorable="w14 w15 w16se w16cid w16 w16cex w16sdtdh w16sdtfl w16du wp14">
+<w:glossaryDocument xmlns:wpc="http://schemas.microsoft.com/office/word/2010/wordprocessingCanvas" xmlns:cx="http://schemas.microsoft.com/office/drawing/2014/chartex" xmlns:cx1="http://schemas.microsoft.com/office/drawing/2015/9/8/chartex" xmlns:cx2="http://schemas.microsoft.com/office/drawing/2015/10/21/chartex" xmlns:cx3="http://schemas.microsoft.com/office/drawing/2016/5/9/chartex" xmlns:cx4="http://schemas.microsoft.com/office/drawing/2016/5/10/chartex" xmlns:cx5="http://schemas.microsoft.com/office/drawing/2016/5/11/chartex" xmlns:cx6="http://schemas.microsoft.com/office/drawing/2016/5/12/chartex" xmlns:cx7="http://schemas.microsoft.com/office/drawing/2016/5/13/chartex" xmlns:cx8="http://schemas.microsoft.com/office/drawing/2016/5/14/chartex" xmlns:mc="http://schemas.openxmlformats.org/markup-compatibility/2006" xmlns:aink="http://schemas.microsoft.com/office/drawing/2016/ink" xmlns:am3d="http://schemas.microsoft.com/office/drawing/2017/model3d" xmlns:o="urn:schemas-microsoft-com:office:office" xmlns:oel="http://schemas.microsoft.com/office/2019/extlst" xmlns:r="http://schemas.openxmlformats.org/officeDocument/2006/relationships" xmlns:m="http://schemas.openxmlformats.org/officeDocument/2006/math" xmlns:v="urn:schemas-microsoft-com:vml" xmlns:wp14="http://schemas.microsoft.com/office/word/2010/wordprocessingDrawing" xmlns:wp="http://schemas.openxmlformats.org/drawingml/2006/wordprocessingDrawing" xmlns:w10="urn:schemas-microsoft-com:office:word" xmlns:w="http://schemas.openxmlformats.org/wordprocessingml/2006/main" xmlns:w14="http://schemas.microsoft.com/office/word/2010/wordml" xmlns:w15="http://schemas.microsoft.com/office/word/2012/wordml" xmlns:w16cex="http://schemas.microsoft.com/office/word/2018/wordml/cex" xmlns:w16cid="http://schemas.microsoft.com/office/word/2016/wordml/cid" xmlns:w16="http://schemas.microsoft.com/office/word/2018/wordml" xmlns:w16du="http://schemas.microsoft.com/office/word/2023/wordml/word16du" xmlns:w16sdtdh="http://schemas.microsoft.com/office/word/2020/wordml/sdtdatahash" xmlns:w16sdtfl="http://schemas.microsoft.com/office/word/2024/wordml/sdtformatlock" xmlns:w16se="http://schemas.microsoft.com/office/word/2015/wordml/symex" xmlns:wpg="http://schemas.microsoft.com/office/word/2010/wordprocessingGroup" xmlns:wpi="http://schemas.microsoft.com/office/word/2010/wordprocessingInk" xmlns:wne="http://schemas.microsoft.com/office/word/2006/wordml" xmlns:wps="http://schemas.microsoft.com/office/word/2010/wordprocessingShape" mc:Ignorable="w14 w15 w16se w16cid w16 w16cex w16sdtdh w16sdtfl w16du wp14">
   <w:docParts>
     <w:docPart>
       <w:docPartPr>
@@ -12749,7 +12757,9 @@
     <w:rsid w:val="004F5B0D"/>
     <w:rsid w:val="00516B68"/>
     <w:rsid w:val="00553A4E"/>
+    <w:rsid w:val="00560201"/>
     <w:rsid w:val="00561B62"/>
+    <w:rsid w:val="00584076"/>
     <w:rsid w:val="00585078"/>
     <w:rsid w:val="005F01BC"/>
     <w:rsid w:val="006067E5"/>
@@ -12758,9 +12768,11 @@
     <w:rsid w:val="006D69A4"/>
     <w:rsid w:val="006F4D90"/>
     <w:rsid w:val="007B521E"/>
+    <w:rsid w:val="008B4188"/>
     <w:rsid w:val="008D5333"/>
     <w:rsid w:val="009C61DE"/>
     <w:rsid w:val="009F13E8"/>
+    <w:rsid w:val="00A062F9"/>
     <w:rsid w:val="00A24EC4"/>
     <w:rsid w:val="00A76324"/>
     <w:rsid w:val="00AB5684"/>
@@ -12775,6 +12787,8 @@
     <w:rsid w:val="00C92BAC"/>
     <w:rsid w:val="00CA7293"/>
     <w:rsid w:val="00CE3A2A"/>
+    <w:rsid w:val="00CE5926"/>
+    <w:rsid w:val="00D50511"/>
     <w:rsid w:val="00D716A1"/>
     <w:rsid w:val="00D7369A"/>
     <w:rsid w:val="00D84400"/>
@@ -12784,9 +12798,11 @@
     <w:rsid w:val="00E83ABB"/>
     <w:rsid w:val="00E87DB4"/>
     <w:rsid w:val="00EA2C41"/>
+    <w:rsid w:val="00ED52FE"/>
     <w:rsid w:val="00EE3902"/>
     <w:rsid w:val="00EF342A"/>
     <w:rsid w:val="00F17C7D"/>
+    <w:rsid w:val="00F2502A"/>
     <w:rsid w:val="00F73F81"/>
   </w:rsids>
   <m:mathPr>

</xml_diff>

<commit_message>
feat: a GWAM report types its own report name
GWAM reports get a Report Name field on Setup. It is required, it prints as the whole title on the cover and in both footers, and it names the file. The application name still prints wherever it did.

Every other segment's report name is built from its segment, application name, report type and the Report Date's year, so each cover now prints that year and each footer gains it. The four masters hold one {{report-name}} token on the cover and in footers 5 and 8.

An Editable copy reads the cover title back as the Report Name and takes the application name from the cover's Application cell. A Retest import leaves the name to the tester. Step 9 of docs/plans/gwam-report-name.md, a check in Word on Windows, is still open.

Co-authored-by: Copilot <223556219+Copilot@users.noreply.github.com>
</commit_message>
<xml_diff>
--- a/resources/MAIN.docx
+++ b/resources/MAIN.docx
@@ -41,49 +41,7 @@
         <w:pStyle w:val="TitlePageHeading3"/>
       </w:pPr>
       <w:r>
-        <w:t>{{</w:t>
-      </w:r>
-      <w:r>
-        <w:t>segment</w:t>
-      </w:r>
-      <w:r>
-        <w:t>}}</w:t>
-      </w:r>
-      <w:r>
-        <w:t xml:space="preserve"> </w:t>
-      </w:r>
-      <w:r>
-        <w:t>–</w:t>
-      </w:r>
-      <w:r>
-        <w:t xml:space="preserve"> </w:t>
-      </w:r>
-      <w:r>
-        <w:t>{{</w:t>
-      </w:r>
-      <w:r>
-        <w:t>app</w:t>
-      </w:r>
-      <w:r>
-        <w:t>-name</w:t>
-      </w:r>
-      <w:r>
-        <w:t>}}</w:t>
-      </w:r>
-      <w:r>
-        <w:t xml:space="preserve"> – </w:t>
-      </w:r>
-      <w:r>
-        <w:t>{{</w:t>
-      </w:r>
-      <w:r>
-        <w:t>test-type</w:t>
-      </w:r>
-      <w:r>
-        <w:t>}}</w:t>
-      </w:r>
-      <w:r>
-        <w:t xml:space="preserve"> 2026</w:t>
+        <w:t>{{report-name}}</w:t>
       </w:r>
     </w:p>
     <w:p>
@@ -7812,41 +7770,7 @@
             </w:rPr>
           </w:pPr>
           <w:r>
-            <w:t>{{</w:t>
-          </w:r>
-          <w:r>
-            <w:t>segment</w:t>
-          </w:r>
-          <w:r>
-            <w:t>}}</w:t>
-          </w:r>
-          <w:r>
-            <w:t xml:space="preserve"> - </w:t>
-          </w:r>
-          <w:r>
-            <w:t>{{</w:t>
-          </w:r>
-          <w:r>
-            <w:t>report-name</w:t>
-          </w:r>
-          <w:r>
-            <w:t>}}</w:t>
-          </w:r>
-          <w:r>
-            <w:t xml:space="preserve"> – </w:t>
-          </w:r>
-          <w:r>
-            <w:t>{{</w:t>
-          </w:r>
-          <w:r>
-            <w:t>test-type</w:t>
-          </w:r>
-          <w:r>
-            <w:rPr>
-              <w:sz w:val="28"/>
-              <w:szCs w:val="28"/>
-            </w:rPr>
-            <w:t>}}</w:t>
+            <w:t>{{report-name}}</w:t>
           </w:r>
         </w:p>
       </w:tc>
@@ -8595,37 +8519,7 @@
             <w:jc w:val="center"/>
           </w:pPr>
           <w:r>
-            <w:t>{{</w:t>
-          </w:r>
-          <w:r>
-            <w:t>segment</w:t>
-          </w:r>
-          <w:r>
-            <w:t>}}</w:t>
-          </w:r>
-          <w:r>
-            <w:t xml:space="preserve"> - </w:t>
-          </w:r>
-          <w:r>
-            <w:t>{{</w:t>
-          </w:r>
-          <w:r>
-            <w:t>report-name</w:t>
-          </w:r>
-          <w:r>
-            <w:t>}}</w:t>
-          </w:r>
-          <w:r>
-            <w:t xml:space="preserve"> – </w:t>
-          </w:r>
-          <w:r>
-            <w:t>{{</w:t>
-          </w:r>
-          <w:r>
-            <w:t>test-type</w:t>
-          </w:r>
-          <w:r>
-            <w:t>}}</w:t>
+            <w:t>{{report-name}}</w:t>
           </w:r>
         </w:p>
       </w:tc>

</xml_diff>